<commit_message>
f: dashboard options updated - add our decision, our chart plan
</commit_message>
<xml_diff>
--- a/docs/dashboard_options.docx
+++ b/docs/dashboard_options.docx
@@ -57,7 +57,6 @@
       <w:pPr>
         <w:spacing w:after="100"/>
         <w:rPr>
-          <w:rFonts w:hint="eastAsia"/>
           <w:color w:val="000000" w:themeColor="text1"/>
           <w:lang w:eastAsia="ko-KR"/>
         </w:rPr>
@@ -92,21 +91,26 @@
         </w:rPr>
         <w:t xml:space="preserve">) · Reviewers: </w:t>
       </w:r>
-      <w:proofErr w:type="spellStart"/>
       <w:r>
         <w:rPr>
           <w:color w:val="000000" w:themeColor="text1"/>
           <w:lang w:eastAsia="ko-KR"/>
         </w:rPr>
-        <w:t>Xialong</w:t>
-      </w:r>
-      <w:proofErr w:type="spellEnd"/>
+        <w:t>Xia</w:t>
+      </w:r>
       <w:r>
         <w:rPr>
           <w:color w:val="000000" w:themeColor="text1"/>
           <w:lang w:eastAsia="ko-KR"/>
         </w:rPr>
-        <w:t xml:space="preserve"> Yang (A), Zhihao Zhang</w:t>
+        <w:t>o</w:t>
+      </w:r>
+      <w:r>
+        <w:rPr>
+          <w:color w:val="000000" w:themeColor="text1"/>
+          <w:lang w:eastAsia="ko-KR"/>
+        </w:rPr>
+        <w:t>long Yang (A), Zhihao Zhang</w:t>
       </w:r>
       <w:r>
         <w:rPr>
@@ -875,13 +879,6 @@
     </w:p>
     <w:p>
       <w:pPr>
-        <w:rPr>
-          <w:lang w:val="en-AU" w:eastAsia="ko-KR"/>
-        </w:rPr>
-      </w:pPr>
-    </w:p>
-    <w:p>
-      <w:pPr>
         <w:pStyle w:val="Heading1"/>
         <w:rPr>
           <w:rFonts w:ascii="Calibri" w:hAnsi="Calibri" w:cs="Calibri"/>
@@ -902,6 +899,1388 @@
           <w:szCs w:val="30"/>
         </w:rPr>
         <w:t>4</w:t>
+      </w:r>
+      <w:r>
+        <w:rPr>
+          <w:rFonts w:ascii="Calibri" w:hAnsi="Calibri" w:cs="Calibri"/>
+          <w:b/>
+          <w:bCs/>
+          <w:color w:val="000000" w:themeColor="text1"/>
+          <w:sz w:val="30"/>
+          <w:szCs w:val="30"/>
+        </w:rPr>
+        <w:t xml:space="preserve">. </w:t>
+      </w:r>
+      <w:r>
+        <w:rPr>
+          <w:rFonts w:ascii="Calibri" w:hAnsi="Calibri" w:cs="Calibri"/>
+          <w:b/>
+          <w:bCs/>
+          <w:color w:val="000000" w:themeColor="text1"/>
+          <w:sz w:val="30"/>
+          <w:szCs w:val="30"/>
+        </w:rPr>
+        <w:t>Decision</w:t>
+      </w:r>
+    </w:p>
+    <w:p>
+      <w:pPr>
+        <w:rPr>
+          <w:lang w:val="en-AU" w:eastAsia="ko-KR"/>
+        </w:rPr>
+      </w:pPr>
+      <w:r>
+        <w:rPr>
+          <w:b/>
+          <w:bCs/>
+          <w:lang w:val="en-AU" w:eastAsia="ko-KR"/>
+        </w:rPr>
+        <w:t>Decision</w:t>
+      </w:r>
+      <w:r>
+        <w:rPr>
+          <w:lang w:val="en-AU" w:eastAsia="ko-KR"/>
+        </w:rPr>
+        <w:t xml:space="preserve">: Excel charts from exported view results. </w:t>
+      </w:r>
+      <w:proofErr w:type="spellStart"/>
+      <w:r>
+        <w:rPr>
+          <w:lang w:val="en-AU" w:eastAsia="ko-KR"/>
+        </w:rPr>
+        <w:t>Metabase</w:t>
+      </w:r>
+      <w:proofErr w:type="spellEnd"/>
+      <w:r>
+        <w:rPr>
+          <w:lang w:val="en-AU" w:eastAsia="ko-KR"/>
+        </w:rPr>
+        <w:t xml:space="preserve"> is not used</w:t>
+      </w:r>
+      <w:r>
+        <w:rPr>
+          <w:lang w:val="en-AU" w:eastAsia="ko-KR"/>
+        </w:rPr>
+        <w:t xml:space="preserve"> </w:t>
+      </w:r>
+      <w:r>
+        <w:rPr>
+          <w:lang w:val="en-AU" w:eastAsia="ko-KR"/>
+        </w:rPr>
+        <w:t>(confirmed by Xiaolong Yang, Thu 9 Oct, Teams; Zhihao Zhang's B-4 handoff in</w:t>
+      </w:r>
+      <w:r>
+        <w:rPr>
+          <w:lang w:val="en-AU" w:eastAsia="ko-KR"/>
+        </w:rPr>
+        <w:t xml:space="preserve"> </w:t>
+      </w:r>
+      <w:r>
+        <w:rPr>
+          <w:lang w:val="en-AU" w:eastAsia="ko-KR"/>
+        </w:rPr>
+        <w:t>docs/</w:t>
+      </w:r>
+      <w:proofErr w:type="spellStart"/>
+      <w:r>
+        <w:rPr>
+          <w:lang w:val="en-AU" w:eastAsia="ko-KR"/>
+        </w:rPr>
+        <w:t>excel_reporting</w:t>
+      </w:r>
+      <w:proofErr w:type="spellEnd"/>
+      <w:r>
+        <w:rPr>
+          <w:lang w:val="en-AU" w:eastAsia="ko-KR"/>
+        </w:rPr>
+        <w:t>/).</w:t>
+      </w:r>
+    </w:p>
+    <w:p>
+      <w:pPr>
+        <w:rPr>
+          <w:lang w:val="en-AU" w:eastAsia="ko-KR"/>
+        </w:rPr>
+      </w:pPr>
+    </w:p>
+    <w:p>
+      <w:pPr>
+        <w:rPr>
+          <w:lang w:val="en-AU" w:eastAsia="ko-KR"/>
+        </w:rPr>
+      </w:pPr>
+      <w:r>
+        <w:rPr>
+          <w:b/>
+          <w:bCs/>
+          <w:lang w:val="en-AU" w:eastAsia="ko-KR"/>
+        </w:rPr>
+        <w:t>Reason</w:t>
+      </w:r>
+      <w:r>
+        <w:rPr>
+          <w:lang w:val="en-AU" w:eastAsia="ko-KR"/>
+        </w:rPr>
+        <w:t xml:space="preserve">: </w:t>
+      </w:r>
+      <w:proofErr w:type="spellStart"/>
+      <w:r>
+        <w:rPr>
+          <w:lang w:val="en-AU" w:eastAsia="ko-KR"/>
+        </w:rPr>
+        <w:t>Metabase</w:t>
+      </w:r>
+      <w:proofErr w:type="spellEnd"/>
+      <w:r>
+        <w:rPr>
+          <w:lang w:val="en-AU" w:eastAsia="ko-KR"/>
+        </w:rPr>
+        <w:t xml:space="preserve"> was not fully deployed and validated on the shared</w:t>
+      </w:r>
+      <w:r>
+        <w:rPr>
+          <w:lang w:val="en-AU" w:eastAsia="ko-KR"/>
+        </w:rPr>
+        <w:t xml:space="preserve"> </w:t>
+      </w:r>
+      <w:r>
+        <w:rPr>
+          <w:lang w:val="en-AU" w:eastAsia="ko-KR"/>
+        </w:rPr>
+        <w:t>server. Completing another service, its HTTPS route, a read-only connection</w:t>
+      </w:r>
+      <w:r>
+        <w:rPr>
+          <w:lang w:val="en-AU" w:eastAsia="ko-KR"/>
+        </w:rPr>
+        <w:t xml:space="preserve"> </w:t>
+      </w:r>
+      <w:r>
+        <w:rPr>
+          <w:lang w:val="en-AU" w:eastAsia="ko-KR"/>
+        </w:rPr>
+        <w:t>and the permission checks would take time away from the 00</w:t>
+      </w:r>
+      <w:r>
+        <w:rPr>
+          <w:rFonts w:hint="eastAsia"/>
+          <w:lang w:val="en-AU" w:eastAsia="ko-KR"/>
+        </w:rPr>
+        <w:t>→</w:t>
+      </w:r>
+      <w:r>
+        <w:rPr>
+          <w:lang w:val="en-AU" w:eastAsia="ko-KR"/>
+        </w:rPr>
+        <w:t>10 integration.</w:t>
+      </w:r>
+      <w:r>
+        <w:rPr>
+          <w:lang w:val="en-AU" w:eastAsia="ko-KR"/>
+        </w:rPr>
+        <w:t xml:space="preserve"> </w:t>
+      </w:r>
+      <w:r>
+        <w:rPr>
+          <w:lang w:val="en-AU" w:eastAsia="ko-KR"/>
+        </w:rPr>
+        <w:t xml:space="preserve">Excel uses </w:t>
+      </w:r>
+      <w:proofErr w:type="gramStart"/>
+      <w:r>
+        <w:rPr>
+          <w:lang w:val="en-AU" w:eastAsia="ko-KR"/>
+        </w:rPr>
+        <w:t>exactly the same</w:t>
+      </w:r>
+      <w:proofErr w:type="gramEnd"/>
+      <w:r>
+        <w:rPr>
+          <w:lang w:val="en-AU" w:eastAsia="ko-KR"/>
+        </w:rPr>
+        <w:t xml:space="preserve"> reporting SQL results, needs no new</w:t>
+      </w:r>
+      <w:r>
+        <w:rPr>
+          <w:lang w:val="en-AU" w:eastAsia="ko-KR"/>
+        </w:rPr>
+        <w:t xml:space="preserve"> </w:t>
+      </w:r>
+      <w:r>
+        <w:rPr>
+          <w:lang w:val="en-AU" w:eastAsia="ko-KR"/>
+        </w:rPr>
+        <w:t xml:space="preserve">infrastructure, and the existing </w:t>
+      </w:r>
+      <w:proofErr w:type="spellStart"/>
+      <w:r>
+        <w:rPr>
+          <w:lang w:val="en-AU" w:eastAsia="ko-KR"/>
+        </w:rPr>
+        <w:t>CloudBeaver</w:t>
+      </w:r>
+      <w:proofErr w:type="spellEnd"/>
+      <w:r>
+        <w:rPr>
+          <w:lang w:val="en-AU" w:eastAsia="ko-KR"/>
+        </w:rPr>
+        <w:t xml:space="preserve"> login is enough.</w:t>
+      </w:r>
+    </w:p>
+    <w:p>
+      <w:pPr>
+        <w:rPr>
+          <w:rFonts w:ascii="Segoe UI Symbol" w:hAnsi="Segoe UI Symbol" w:cs="Segoe UI Symbol"/>
+          <w:lang w:val="en-AU" w:eastAsia="ko-KR"/>
+        </w:rPr>
+      </w:pPr>
+    </w:p>
+    <w:p>
+      <w:pPr>
+        <w:rPr>
+          <w:lang w:val="en-AU" w:eastAsia="ko-KR"/>
+        </w:rPr>
+      </w:pPr>
+      <w:r>
+        <w:rPr>
+          <w:b/>
+          <w:bCs/>
+          <w:lang w:val="en-AU" w:eastAsia="ko-KR"/>
+        </w:rPr>
+        <w:t>How it works</w:t>
+      </w:r>
+      <w:r>
+        <w:rPr>
+          <w:lang w:val="en-AU" w:eastAsia="ko-KR"/>
+        </w:rPr>
+        <w:t>: B's template B_Reporting_Export_20261007.xlsx (Control, Checks,</w:t>
+      </w:r>
+      <w:r>
+        <w:rPr>
+          <w:lang w:val="en-AU" w:eastAsia="ko-KR"/>
+        </w:rPr>
+        <w:t xml:space="preserve"> </w:t>
+      </w:r>
+      <w:r>
+        <w:rPr>
+          <w:lang w:val="en-AU" w:eastAsia="ko-KR"/>
+        </w:rPr>
+        <w:t>Queries, UC1–UC4 sheets) is copied by F and never edited in the original. As</w:t>
+      </w:r>
+      <w:r>
+        <w:rPr>
+          <w:lang w:val="en-AU" w:eastAsia="ko-KR"/>
+        </w:rPr>
+        <w:t xml:space="preserve"> </w:t>
+      </w:r>
+      <w:r>
+        <w:rPr>
+          <w:lang w:val="en-AU" w:eastAsia="ko-KR"/>
+        </w:rPr>
+        <w:t>each view is accepted (vw_uc2 Fri 18:00, vw_uc1/vw_uc3 Fri 21:00, vw_uc4 Sat</w:t>
+      </w:r>
+      <w:r>
+        <w:rPr>
+          <w:lang w:val="en-AU" w:eastAsia="ko-KR"/>
+        </w:rPr>
+        <w:t xml:space="preserve"> </w:t>
+      </w:r>
+      <w:r>
+        <w:rPr>
+          <w:lang w:val="en-AU" w:eastAsia="ko-KR"/>
+        </w:rPr>
+        <w:t xml:space="preserve">12:00), F runs the Queries-sheet SELECT in </w:t>
+      </w:r>
+      <w:proofErr w:type="spellStart"/>
+      <w:r>
+        <w:rPr>
+          <w:lang w:val="en-AU" w:eastAsia="ko-KR"/>
+        </w:rPr>
+        <w:t>CloudBeaver</w:t>
+      </w:r>
+      <w:proofErr w:type="spellEnd"/>
+      <w:r>
+        <w:rPr>
+          <w:lang w:val="en-AU" w:eastAsia="ko-KR"/>
+        </w:rPr>
+        <w:t>, exports CSV (UTF-8,</w:t>
+      </w:r>
+      <w:r>
+        <w:rPr>
+          <w:lang w:val="en-AU" w:eastAsia="ko-KR"/>
+        </w:rPr>
+        <w:t xml:space="preserve"> </w:t>
+      </w:r>
+      <w:r>
+        <w:rPr>
+          <w:lang w:val="en-AU" w:eastAsia="ko-KR"/>
+        </w:rPr>
+        <w:t>header, NULL empty), pastes it into the matching sheet and completes Checks</w:t>
+      </w:r>
+      <w:r>
+        <w:rPr>
+          <w:lang w:val="en-AU" w:eastAsia="ko-KR"/>
+        </w:rPr>
+        <w:t xml:space="preserve"> </w:t>
+      </w:r>
+      <w:r>
+        <w:rPr>
+          <w:lang w:val="en-AU" w:eastAsia="ko-KR"/>
+        </w:rPr>
+        <w:t>(row counts 8 / 11 / 16 / 2 and status counts). Views not yet accepted stay</w:t>
+      </w:r>
+      <w:r>
+        <w:rPr>
+          <w:lang w:val="en-AU" w:eastAsia="ko-KR"/>
+        </w:rPr>
+        <w:t xml:space="preserve"> </w:t>
+      </w:r>
+      <w:r>
+        <w:rPr>
+          <w:lang w:val="en-AU" w:eastAsia="ko-KR"/>
+        </w:rPr>
+        <w:t>marked PENDING in Control. The workbook is a snapshot: after any pipeline</w:t>
+      </w:r>
+      <w:r>
+        <w:rPr>
+          <w:lang w:val="en-AU" w:eastAsia="ko-KR"/>
+        </w:rPr>
+        <w:t xml:space="preserve"> </w:t>
+      </w:r>
+      <w:r>
+        <w:rPr>
+          <w:lang w:val="en-AU" w:eastAsia="ko-KR"/>
+        </w:rPr>
+        <w:t>rerun or parameter change all affected CSVs are re-exported and Checks</w:t>
+      </w:r>
+    </w:p>
+    <w:p>
+      <w:pPr>
+        <w:rPr>
+          <w:lang w:val="en-AU" w:eastAsia="ko-KR"/>
+        </w:rPr>
+      </w:pPr>
+      <w:r>
+        <w:rPr>
+          <w:lang w:val="en-AU" w:eastAsia="ko-KR"/>
+        </w:rPr>
+        <w:lastRenderedPageBreak/>
+        <w:t xml:space="preserve">repeated before the charts are published. </w:t>
+      </w:r>
+      <w:proofErr w:type="spellStart"/>
+      <w:r>
+        <w:rPr>
+          <w:lang w:val="en-AU" w:eastAsia="ko-KR"/>
+        </w:rPr>
+        <w:t>export_reporting.sql</w:t>
+      </w:r>
+      <w:proofErr w:type="spellEnd"/>
+      <w:r>
+        <w:rPr>
+          <w:lang w:val="en-AU" w:eastAsia="ko-KR"/>
+        </w:rPr>
+        <w:t xml:space="preserve"> is run by B</w:t>
+      </w:r>
+      <w:r>
+        <w:rPr>
+          <w:lang w:val="en-AU" w:eastAsia="ko-KR"/>
+        </w:rPr>
+        <w:t xml:space="preserve"> </w:t>
+      </w:r>
+      <w:r>
+        <w:rPr>
+          <w:lang w:val="en-AU" w:eastAsia="ko-KR"/>
+        </w:rPr>
+        <w:t xml:space="preserve">only, with </w:t>
+      </w:r>
+      <w:proofErr w:type="spellStart"/>
+      <w:r>
+        <w:rPr>
+          <w:lang w:val="en-AU" w:eastAsia="ko-KR"/>
+        </w:rPr>
+        <w:t>psql</w:t>
+      </w:r>
+      <w:proofErr w:type="spellEnd"/>
+      <w:r>
+        <w:rPr>
+          <w:lang w:val="en-AU" w:eastAsia="ko-KR"/>
+        </w:rPr>
+        <w:t>, once all four views are accepted, to produce one consistent</w:t>
+      </w:r>
+      <w:r>
+        <w:rPr>
+          <w:lang w:val="en-AU" w:eastAsia="ko-KR"/>
+        </w:rPr>
+        <w:t xml:space="preserve"> </w:t>
+      </w:r>
+      <w:r>
+        <w:rPr>
+          <w:lang w:val="en-AU" w:eastAsia="ko-KR"/>
+        </w:rPr>
+        <w:t>snapshot (uc1–uc4.csv + export_metadata.csv).</w:t>
+      </w:r>
+    </w:p>
+    <w:p>
+      <w:pPr>
+        <w:rPr>
+          <w:lang w:val="en-AU" w:eastAsia="ko-KR"/>
+        </w:rPr>
+      </w:pPr>
+    </w:p>
+    <w:p>
+      <w:pPr>
+        <w:rPr>
+          <w:lang w:val="en-AU" w:eastAsia="ko-KR"/>
+        </w:rPr>
+      </w:pPr>
+      <w:r>
+        <w:rPr>
+          <w:b/>
+          <w:bCs/>
+          <w:lang w:val="en-AU" w:eastAsia="ko-KR"/>
+        </w:rPr>
+        <w:t>Limitation accepted</w:t>
+      </w:r>
+      <w:r>
+        <w:rPr>
+          <w:lang w:val="en-AU" w:eastAsia="ko-KR"/>
+        </w:rPr>
+        <w:t xml:space="preserve">: charts are static. For the demo video the </w:t>
+      </w:r>
+      <w:proofErr w:type="spellStart"/>
+      <w:proofErr w:type="gramStart"/>
+      <w:r>
+        <w:rPr>
+          <w:lang w:val="en-AU" w:eastAsia="ko-KR"/>
+        </w:rPr>
+        <w:t>CloudBeaver</w:t>
+      </w:r>
+      <w:proofErr w:type="spellEnd"/>
+      <w:r>
+        <w:rPr>
+          <w:lang w:val="en-AU" w:eastAsia="ko-KR"/>
+        </w:rPr>
+        <w:t xml:space="preserve"> </w:t>
+      </w:r>
+      <w:r>
+        <w:rPr>
+          <w:lang w:val="en-AU" w:eastAsia="ko-KR"/>
+        </w:rPr>
+        <w:t xml:space="preserve"> </w:t>
+      </w:r>
+      <w:r>
+        <w:rPr>
+          <w:lang w:val="en-AU" w:eastAsia="ko-KR"/>
+        </w:rPr>
+        <w:t>query</w:t>
+      </w:r>
+      <w:proofErr w:type="gramEnd"/>
+      <w:r>
+        <w:rPr>
+          <w:lang w:val="en-AU" w:eastAsia="ko-KR"/>
+        </w:rPr>
+        <w:t xml:space="preserve"> result and the Excel chart are shown side by side to evidence that the chart reflects the live view.</w:t>
+      </w:r>
+    </w:p>
+    <w:p>
+      <w:pPr>
+        <w:pStyle w:val="Heading1"/>
+        <w:rPr>
+          <w:rFonts w:ascii="Calibri" w:hAnsi="Calibri" w:cs="Calibri"/>
+          <w:b/>
+          <w:bCs/>
+          <w:color w:val="000000" w:themeColor="text1"/>
+          <w:sz w:val="30"/>
+          <w:szCs w:val="30"/>
+        </w:rPr>
+      </w:pPr>
+      <w:r>
+        <w:rPr>
+          <w:rFonts w:ascii="Calibri" w:hAnsi="Calibri" w:cs="Calibri"/>
+          <w:b/>
+          <w:bCs/>
+          <w:color w:val="000000" w:themeColor="text1"/>
+          <w:sz w:val="30"/>
+          <w:szCs w:val="30"/>
+        </w:rPr>
+        <w:t>5</w:t>
+      </w:r>
+      <w:r>
+        <w:rPr>
+          <w:rFonts w:ascii="Calibri" w:hAnsi="Calibri" w:cs="Calibri"/>
+          <w:b/>
+          <w:bCs/>
+          <w:color w:val="000000" w:themeColor="text1"/>
+          <w:sz w:val="30"/>
+          <w:szCs w:val="30"/>
+        </w:rPr>
+        <w:t xml:space="preserve">. </w:t>
+      </w:r>
+      <w:r>
+        <w:rPr>
+          <w:rFonts w:ascii="Calibri" w:hAnsi="Calibri" w:cs="Calibri"/>
+          <w:b/>
+          <w:bCs/>
+          <w:color w:val="000000" w:themeColor="text1"/>
+          <w:sz w:val="30"/>
+          <w:szCs w:val="30"/>
+        </w:rPr>
+        <w:t>Chart plan</w:t>
+      </w:r>
+    </w:p>
+    <w:p>
+      <w:pPr>
+        <w:rPr>
+          <w:lang w:val="en-AU" w:eastAsia="ko-KR"/>
+        </w:rPr>
+      </w:pPr>
+      <w:r>
+        <w:rPr>
+          <w:lang w:val="en-AU" w:eastAsia="ko-KR"/>
+        </w:rPr>
+        <w:t xml:space="preserve">Charts use only the statuses and values supplied by the views; no business rule is re-implemented in Excel. </w:t>
+      </w:r>
+    </w:p>
+    <w:p>
+      <w:pPr>
+        <w:rPr>
+          <w:lang w:val="en-AU" w:eastAsia="ko-KR"/>
+        </w:rPr>
+      </w:pPr>
+    </w:p>
+    <w:tbl>
+      <w:tblPr>
+        <w:tblStyle w:val="TableGrid"/>
+        <w:tblW w:w="0" w:type="auto"/>
+        <w:tblLayout w:type="fixed"/>
+        <w:tblLook w:val="04A0" w:firstRow="1" w:lastRow="0" w:firstColumn="1" w:lastColumn="0" w:noHBand="0" w:noVBand="1"/>
+      </w:tblPr>
+      <w:tblGrid>
+        <w:gridCol w:w="704"/>
+        <w:gridCol w:w="1276"/>
+        <w:gridCol w:w="3004"/>
+        <w:gridCol w:w="1886"/>
+        <w:gridCol w:w="2146"/>
+      </w:tblGrid>
+      <w:tr>
+        <w:tc>
+          <w:tcPr>
+            <w:tcW w:w="704" w:type="dxa"/>
+            <w:shd w:val="clear" w:color="auto" w:fill="BFBFBF" w:themeFill="background1" w:themeFillShade="BF"/>
+          </w:tcPr>
+          <w:p>
+            <w:pPr>
+              <w:rPr>
+                <w:lang w:val="en-AU" w:eastAsia="ko-KR"/>
+              </w:rPr>
+            </w:pPr>
+            <w:r>
+              <w:rPr>
+                <w:lang w:val="en-AU" w:eastAsia="ko-KR"/>
+              </w:rPr>
+              <w:t>Use case</w:t>
+            </w:r>
+          </w:p>
+        </w:tc>
+        <w:tc>
+          <w:tcPr>
+            <w:tcW w:w="1276" w:type="dxa"/>
+            <w:shd w:val="clear" w:color="auto" w:fill="BFBFBF" w:themeFill="background1" w:themeFillShade="BF"/>
+          </w:tcPr>
+          <w:p>
+            <w:pPr>
+              <w:rPr>
+                <w:lang w:val="en-AU" w:eastAsia="ko-KR"/>
+              </w:rPr>
+            </w:pPr>
+            <w:r>
+              <w:rPr>
+                <w:lang w:val="en-AU" w:eastAsia="ko-KR"/>
+              </w:rPr>
+              <w:t>View</w:t>
+            </w:r>
+          </w:p>
+        </w:tc>
+        <w:tc>
+          <w:tcPr>
+            <w:tcW w:w="3004" w:type="dxa"/>
+            <w:shd w:val="clear" w:color="auto" w:fill="BFBFBF" w:themeFill="background1" w:themeFillShade="BF"/>
+          </w:tcPr>
+          <w:p>
+            <w:pPr>
+              <w:rPr>
+                <w:lang w:val="en-AU" w:eastAsia="ko-KR"/>
+              </w:rPr>
+            </w:pPr>
+            <w:r>
+              <w:rPr>
+                <w:lang w:val="en-AU" w:eastAsia="ko-KR"/>
+              </w:rPr>
+              <w:t>Chart type</w:t>
+            </w:r>
+          </w:p>
+        </w:tc>
+        <w:tc>
+          <w:tcPr>
+            <w:tcW w:w="1886" w:type="dxa"/>
+            <w:shd w:val="clear" w:color="auto" w:fill="BFBFBF" w:themeFill="background1" w:themeFillShade="BF"/>
+          </w:tcPr>
+          <w:p>
+            <w:pPr>
+              <w:rPr>
+                <w:lang w:val="en-AU" w:eastAsia="ko-KR"/>
+              </w:rPr>
+            </w:pPr>
+            <w:r>
+              <w:rPr>
+                <w:lang w:val="en-AU" w:eastAsia="ko-KR"/>
+              </w:rPr>
+              <w:t>Columns used</w:t>
+            </w:r>
+          </w:p>
+        </w:tc>
+        <w:tc>
+          <w:tcPr>
+            <w:tcW w:w="2146" w:type="dxa"/>
+            <w:shd w:val="clear" w:color="auto" w:fill="BFBFBF" w:themeFill="background1" w:themeFillShade="BF"/>
+          </w:tcPr>
+          <w:p>
+            <w:pPr>
+              <w:rPr>
+                <w:lang w:val="en-AU" w:eastAsia="ko-KR"/>
+              </w:rPr>
+            </w:pPr>
+            <w:r>
+              <w:rPr>
+                <w:lang w:val="en-AU" w:eastAsia="ko-KR"/>
+              </w:rPr>
+              <w:t>Expected result</w:t>
+            </w:r>
+          </w:p>
+        </w:tc>
+      </w:tr>
+      <w:tr>
+        <w:tc>
+          <w:tcPr>
+            <w:tcW w:w="704" w:type="dxa"/>
+          </w:tcPr>
+          <w:p>
+            <w:pPr>
+              <w:rPr>
+                <w:lang w:val="en-AU" w:eastAsia="ko-KR"/>
+              </w:rPr>
+            </w:pPr>
+            <w:r>
+              <w:rPr>
+                <w:lang w:val="en-AU" w:eastAsia="ko-KR"/>
+              </w:rPr>
+              <w:t>UC1</w:t>
+            </w:r>
+          </w:p>
+        </w:tc>
+        <w:tc>
+          <w:tcPr>
+            <w:tcW w:w="1276" w:type="dxa"/>
+          </w:tcPr>
+          <w:p>
+            <w:pPr>
+              <w:rPr>
+                <w:lang w:val="en-AU" w:eastAsia="ko-KR"/>
+              </w:rPr>
+            </w:pPr>
+            <w:proofErr w:type="gramStart"/>
+            <w:r>
+              <w:rPr>
+                <w:lang w:val="en-AU" w:eastAsia="ko-KR"/>
+              </w:rPr>
+              <w:t>reporting.vw</w:t>
+            </w:r>
+            <w:proofErr w:type="gramEnd"/>
+            <w:r>
+              <w:rPr>
+                <w:lang w:val="en-AU" w:eastAsia="ko-KR"/>
+              </w:rPr>
+              <w:t>_uc1_care_gaps</w:t>
+            </w:r>
+            <w:r>
+              <w:rPr>
+                <w:lang w:val="en-AU" w:eastAsia="ko-KR"/>
+              </w:rPr>
+              <w:t xml:space="preserve"> </w:t>
+            </w:r>
+          </w:p>
+        </w:tc>
+        <w:tc>
+          <w:tcPr>
+            <w:tcW w:w="3004" w:type="dxa"/>
+          </w:tcPr>
+          <w:p>
+            <w:pPr>
+              <w:rPr>
+                <w:lang w:val="en-AU" w:eastAsia="ko-KR"/>
+              </w:rPr>
+            </w:pPr>
+            <w:r>
+              <w:rPr>
+                <w:lang w:val="en-AU" w:eastAsia="ko-KR"/>
+              </w:rPr>
+              <w:t>Clustered column chart: number of patients per care-gap status</w:t>
+            </w:r>
+          </w:p>
+        </w:tc>
+        <w:tc>
+          <w:tcPr>
+            <w:tcW w:w="1886" w:type="dxa"/>
+          </w:tcPr>
+          <w:p>
+            <w:pPr>
+              <w:rPr>
+                <w:lang w:val="en-AU" w:eastAsia="ko-KR"/>
+              </w:rPr>
+            </w:pPr>
+            <w:proofErr w:type="spellStart"/>
+            <w:r>
+              <w:rPr>
+                <w:lang w:val="en-AU" w:eastAsia="ko-KR"/>
+              </w:rPr>
+              <w:t>care_gap_status</w:t>
+            </w:r>
+            <w:proofErr w:type="spellEnd"/>
+            <w:r>
+              <w:rPr>
+                <w:lang w:val="en-AU" w:eastAsia="ko-KR"/>
+              </w:rPr>
+              <w:t xml:space="preserve"> (category), count of </w:t>
+            </w:r>
+            <w:proofErr w:type="spellStart"/>
+            <w:r>
+              <w:rPr>
+                <w:lang w:val="en-AU" w:eastAsia="ko-KR"/>
+              </w:rPr>
+              <w:t>patient_id</w:t>
+            </w:r>
+            <w:proofErr w:type="spellEnd"/>
+            <w:r>
+              <w:rPr>
+                <w:lang w:val="en-AU" w:eastAsia="ko-KR"/>
+              </w:rPr>
+              <w:t xml:space="preserve"> (value); </w:t>
+            </w:r>
+            <w:proofErr w:type="spellStart"/>
+            <w:r>
+              <w:rPr>
+                <w:lang w:val="en-AU" w:eastAsia="ko-KR"/>
+              </w:rPr>
+              <w:t>display_name</w:t>
+            </w:r>
+            <w:proofErr w:type="spellEnd"/>
+            <w:r>
+              <w:rPr>
+                <w:lang w:val="en-AU" w:eastAsia="ko-KR"/>
+              </w:rPr>
+              <w:t xml:space="preserve">, </w:t>
+            </w:r>
+            <w:proofErr w:type="spellStart"/>
+            <w:r>
+              <w:rPr>
+                <w:lang w:val="en-AU" w:eastAsia="ko-KR"/>
+              </w:rPr>
+              <w:t>last_test_date</w:t>
+            </w:r>
+            <w:proofErr w:type="spellEnd"/>
+            <w:r>
+              <w:rPr>
+                <w:lang w:val="en-AU" w:eastAsia="ko-KR"/>
+              </w:rPr>
+              <w:t xml:space="preserve">, last_hba1c_mmol_mol, </w:t>
+            </w:r>
+            <w:proofErr w:type="spellStart"/>
+            <w:r>
+              <w:rPr>
+                <w:lang w:val="en-AU" w:eastAsia="ko-KR"/>
+              </w:rPr>
+              <w:t>first_review_date</w:t>
+            </w:r>
+            <w:proofErr w:type="spellEnd"/>
+            <w:r>
+              <w:rPr>
+                <w:lang w:val="en-AU" w:eastAsia="ko-KR"/>
+              </w:rPr>
+              <w:t xml:space="preserve"> in the supporting table</w:t>
+            </w:r>
+          </w:p>
+        </w:tc>
+        <w:tc>
+          <w:tcPr>
+            <w:tcW w:w="2146" w:type="dxa"/>
+          </w:tcPr>
+          <w:p>
+            <w:pPr>
+              <w:rPr>
+                <w:lang w:val="en-AU" w:eastAsia="ko-KR"/>
+              </w:rPr>
+            </w:pPr>
+            <w:r>
+              <w:rPr>
+                <w:lang w:val="en-AU" w:eastAsia="ko-KR"/>
+              </w:rPr>
+              <w:t>8 patients: HIGH_NO_REVIEW 2, HIGH_REVIEW_PENDING 3, OVERDUE_TEST 2, NO_TEST_ON_RECORD 1</w:t>
+            </w:r>
+          </w:p>
+        </w:tc>
+      </w:tr>
+      <w:tr>
+        <w:tc>
+          <w:tcPr>
+            <w:tcW w:w="704" w:type="dxa"/>
+          </w:tcPr>
+          <w:p>
+            <w:pPr>
+              <w:rPr>
+                <w:lang w:val="en-AU" w:eastAsia="ko-KR"/>
+              </w:rPr>
+            </w:pPr>
+            <w:r>
+              <w:rPr>
+                <w:lang w:val="en-AU" w:eastAsia="ko-KR"/>
+              </w:rPr>
+              <w:t>UC2</w:t>
+            </w:r>
+          </w:p>
+        </w:tc>
+        <w:tc>
+          <w:tcPr>
+            <w:tcW w:w="1276" w:type="dxa"/>
+          </w:tcPr>
+          <w:p>
+            <w:pPr>
+              <w:rPr>
+                <w:lang w:val="en-AU" w:eastAsia="ko-KR"/>
+              </w:rPr>
+            </w:pPr>
+            <w:proofErr w:type="gramStart"/>
+            <w:r>
+              <w:rPr>
+                <w:lang w:val="en-AU" w:eastAsia="ko-KR"/>
+              </w:rPr>
+              <w:t>reporting.vw</w:t>
+            </w:r>
+            <w:proofErr w:type="gramEnd"/>
+            <w:r>
+              <w:rPr>
+                <w:lang w:val="en-AU" w:eastAsia="ko-KR"/>
+              </w:rPr>
+              <w:t>_uc2_pdc</w:t>
+            </w:r>
+          </w:p>
+        </w:tc>
+        <w:tc>
+          <w:tcPr>
+            <w:tcW w:w="3004" w:type="dxa"/>
+          </w:tcPr>
+          <w:p>
+            <w:pPr>
+              <w:rPr>
+                <w:lang w:val="en-AU" w:eastAsia="ko-KR"/>
+              </w:rPr>
+            </w:pPr>
+            <w:r>
+              <w:rPr>
+                <w:lang w:val="en-AU" w:eastAsia="ko-KR"/>
+              </w:rPr>
+              <w:t xml:space="preserve">Horizontal bar chart: PDC per patient, sorted ascending, bars coloured by adherence status, with a vertical reference line at the 0.8 threshold </w:t>
+            </w:r>
+          </w:p>
+        </w:tc>
+        <w:tc>
+          <w:tcPr>
+            <w:tcW w:w="1886" w:type="dxa"/>
+          </w:tcPr>
+          <w:p>
+            <w:pPr>
+              <w:rPr>
+                <w:lang w:val="en-AU" w:eastAsia="ko-KR"/>
+              </w:rPr>
+            </w:pPr>
+            <w:proofErr w:type="spellStart"/>
+            <w:r>
+              <w:rPr>
+                <w:lang w:val="en-AU" w:eastAsia="ko-KR"/>
+              </w:rPr>
+              <w:t>patient_id</w:t>
+            </w:r>
+            <w:proofErr w:type="spellEnd"/>
+            <w:r>
+              <w:rPr>
+                <w:lang w:val="en-AU" w:eastAsia="ko-KR"/>
+              </w:rPr>
+              <w:t xml:space="preserve"> + </w:t>
+            </w:r>
+            <w:proofErr w:type="spellStart"/>
+            <w:r>
+              <w:rPr>
+                <w:lang w:val="en-AU" w:eastAsia="ko-KR"/>
+              </w:rPr>
+              <w:t>display_name</w:t>
+            </w:r>
+            <w:proofErr w:type="spellEnd"/>
+            <w:r>
+              <w:rPr>
+                <w:lang w:val="en-AU" w:eastAsia="ko-KR"/>
+              </w:rPr>
+              <w:t xml:space="preserve"> (axis label), </w:t>
+            </w:r>
+            <w:proofErr w:type="spellStart"/>
+            <w:r>
+              <w:rPr>
+                <w:lang w:val="en-AU" w:eastAsia="ko-KR"/>
+              </w:rPr>
+              <w:t>pdc</w:t>
+            </w:r>
+            <w:proofErr w:type="spellEnd"/>
+            <w:r>
+              <w:rPr>
+                <w:lang w:val="en-AU" w:eastAsia="ko-KR"/>
+              </w:rPr>
+              <w:t xml:space="preserve"> (value), </w:t>
+            </w:r>
+            <w:proofErr w:type="spellStart"/>
+            <w:r>
+              <w:rPr>
+                <w:lang w:val="en-AU" w:eastAsia="ko-KR"/>
+              </w:rPr>
+              <w:t>adherence_status</w:t>
+            </w:r>
+            <w:proofErr w:type="spellEnd"/>
+            <w:r>
+              <w:rPr>
+                <w:lang w:val="en-AU" w:eastAsia="ko-KR"/>
+              </w:rPr>
+              <w:t xml:space="preserve"> (colour), </w:t>
+            </w:r>
+            <w:proofErr w:type="spellStart"/>
+            <w:r>
+              <w:rPr>
+                <w:lang w:val="en-AU" w:eastAsia="ko-KR"/>
+              </w:rPr>
+              <w:t>drug_class</w:t>
+            </w:r>
+            <w:proofErr w:type="spellEnd"/>
+            <w:r>
+              <w:rPr>
+                <w:lang w:val="en-AU" w:eastAsia="ko-KR"/>
+              </w:rPr>
+              <w:t xml:space="preserve"> (data label)</w:t>
+            </w:r>
+          </w:p>
+        </w:tc>
+        <w:tc>
+          <w:tcPr>
+            <w:tcW w:w="2146" w:type="dxa"/>
+          </w:tcPr>
+          <w:p>
+            <w:pPr>
+              <w:rPr>
+                <w:lang w:val="en-AU" w:eastAsia="ko-KR"/>
+              </w:rPr>
+            </w:pPr>
+            <w:r>
+              <w:rPr>
+                <w:lang w:val="en-AU" w:eastAsia="ko-KR"/>
+              </w:rPr>
+              <w:t xml:space="preserve">11 rows: ADHERENT 9, NON_ADHERENT 2 (GL-0002 0.333, GL-0010 0.500) </w:t>
+            </w:r>
+          </w:p>
+        </w:tc>
+      </w:tr>
+      <w:tr>
+        <w:tc>
+          <w:tcPr>
+            <w:tcW w:w="704" w:type="dxa"/>
+          </w:tcPr>
+          <w:p>
+            <w:pPr>
+              <w:rPr>
+                <w:lang w:val="en-AU" w:eastAsia="ko-KR"/>
+              </w:rPr>
+            </w:pPr>
+            <w:r>
+              <w:rPr>
+                <w:lang w:val="en-AU" w:eastAsia="ko-KR"/>
+              </w:rPr>
+              <w:t>UC3</w:t>
+            </w:r>
+          </w:p>
+        </w:tc>
+        <w:tc>
+          <w:tcPr>
+            <w:tcW w:w="1276" w:type="dxa"/>
+          </w:tcPr>
+          <w:p>
+            <w:pPr>
+              <w:rPr>
+                <w:lang w:val="en-AU" w:eastAsia="ko-KR"/>
+              </w:rPr>
+            </w:pPr>
+            <w:proofErr w:type="gramStart"/>
+            <w:r>
+              <w:rPr>
+                <w:lang w:val="en-AU" w:eastAsia="ko-KR"/>
+              </w:rPr>
+              <w:t>reporting.vw</w:t>
+            </w:r>
+            <w:proofErr w:type="gramEnd"/>
+            <w:r>
+              <w:rPr>
+                <w:lang w:val="en-AU" w:eastAsia="ko-KR"/>
+              </w:rPr>
+              <w:t>_uc3_hba1c_trend</w:t>
+            </w:r>
+          </w:p>
+        </w:tc>
+        <w:tc>
+          <w:tcPr>
+            <w:tcW w:w="3004" w:type="dxa"/>
+          </w:tcPr>
+          <w:p>
+            <w:pPr>
+              <w:rPr>
+                <w:lang w:val="en-AU" w:eastAsia="ko-KR"/>
+              </w:rPr>
+            </w:pPr>
+            <w:r>
+              <w:rPr>
+                <w:lang w:val="en-AU" w:eastAsia="ko-KR"/>
+              </w:rPr>
+              <w:t xml:space="preserve">Column chart: HbA1c change (mmol/mol) per patient, coloured by trend status; patients with </w:t>
+            </w:r>
+            <w:proofErr w:type="spellStart"/>
+            <w:r>
+              <w:rPr>
+                <w:lang w:val="en-AU" w:eastAsia="ko-KR"/>
+              </w:rPr>
+              <w:t>rising_despite_adherence</w:t>
+            </w:r>
+            <w:proofErr w:type="spellEnd"/>
+            <w:r>
+              <w:rPr>
+                <w:lang w:val="en-AU" w:eastAsia="ko-KR"/>
+              </w:rPr>
+              <w:t xml:space="preserve"> = true marked; INSUFFICIENT_HISTORY shown as blank, not zero</w:t>
+            </w:r>
+          </w:p>
+        </w:tc>
+        <w:tc>
+          <w:tcPr>
+            <w:tcW w:w="1886" w:type="dxa"/>
+          </w:tcPr>
+          <w:p>
+            <w:pPr>
+              <w:rPr>
+                <w:lang w:val="en-AU" w:eastAsia="ko-KR"/>
+              </w:rPr>
+            </w:pPr>
+            <w:proofErr w:type="spellStart"/>
+            <w:r>
+              <w:rPr>
+                <w:lang w:val="en-AU" w:eastAsia="ko-KR"/>
+              </w:rPr>
+              <w:t>patient_id</w:t>
+            </w:r>
+            <w:proofErr w:type="spellEnd"/>
+            <w:r>
+              <w:rPr>
+                <w:lang w:val="en-AU" w:eastAsia="ko-KR"/>
+              </w:rPr>
+              <w:t xml:space="preserve"> + </w:t>
+            </w:r>
+            <w:proofErr w:type="spellStart"/>
+            <w:r>
+              <w:rPr>
+                <w:lang w:val="en-AU" w:eastAsia="ko-KR"/>
+              </w:rPr>
+              <w:t>display_name</w:t>
+            </w:r>
+            <w:proofErr w:type="spellEnd"/>
+            <w:r>
+              <w:rPr>
+                <w:lang w:val="en-AU" w:eastAsia="ko-KR"/>
+              </w:rPr>
+              <w:t xml:space="preserve"> (axis), </w:t>
+            </w:r>
+            <w:proofErr w:type="spellStart"/>
+            <w:r>
+              <w:rPr>
+                <w:lang w:val="en-AU" w:eastAsia="ko-KR"/>
+              </w:rPr>
+              <w:t>change_mmol_mol</w:t>
+            </w:r>
+            <w:proofErr w:type="spellEnd"/>
+            <w:r>
+              <w:rPr>
+                <w:lang w:val="en-AU" w:eastAsia="ko-KR"/>
+              </w:rPr>
+              <w:t xml:space="preserve"> (value), </w:t>
+            </w:r>
+            <w:proofErr w:type="spellStart"/>
+            <w:r>
+              <w:rPr>
+                <w:lang w:val="en-AU" w:eastAsia="ko-KR"/>
+              </w:rPr>
+              <w:t>trend_status</w:t>
+            </w:r>
+            <w:proofErr w:type="spellEnd"/>
+            <w:r>
+              <w:rPr>
+                <w:lang w:val="en-AU" w:eastAsia="ko-KR"/>
+              </w:rPr>
+              <w:t xml:space="preserve"> (colour), </w:t>
+            </w:r>
+            <w:proofErr w:type="spellStart"/>
+            <w:r>
+              <w:rPr>
+                <w:lang w:val="en-AU" w:eastAsia="ko-KR"/>
+              </w:rPr>
+              <w:t>rising_despite_adherence</w:t>
+            </w:r>
+            <w:proofErr w:type="spellEnd"/>
+            <w:r>
+              <w:rPr>
+                <w:lang w:val="en-AU" w:eastAsia="ko-KR"/>
+              </w:rPr>
+              <w:t xml:space="preserve"> (marker), first_hba1c, last_hba1c, </w:t>
+            </w:r>
+            <w:proofErr w:type="spellStart"/>
+            <w:r>
+              <w:rPr>
+                <w:lang w:val="en-AU" w:eastAsia="ko-KR"/>
+              </w:rPr>
+              <w:t>best_pdc</w:t>
+            </w:r>
+            <w:proofErr w:type="spellEnd"/>
+            <w:r>
+              <w:rPr>
+                <w:lang w:val="en-AU" w:eastAsia="ko-KR"/>
+              </w:rPr>
+              <w:t xml:space="preserve"> (tooltip/table) </w:t>
+            </w:r>
+          </w:p>
+        </w:tc>
+        <w:tc>
+          <w:tcPr>
+            <w:tcW w:w="2146" w:type="dxa"/>
+          </w:tcPr>
+          <w:p>
+            <w:pPr>
+              <w:rPr>
+                <w:lang w:val="en-AU" w:eastAsia="ko-KR"/>
+              </w:rPr>
+            </w:pPr>
+            <w:r>
+              <w:rPr>
+                <w:lang w:val="en-AU" w:eastAsia="ko-KR"/>
+              </w:rPr>
+              <w:t xml:space="preserve">16 rows: RISING 4, STABLE 7, INSUFFICIENT_HISTORY 5, FALLING 0; rising despite adherence 2 (GL-0001, GL-0016) </w:t>
+            </w:r>
+          </w:p>
+        </w:tc>
+      </w:tr>
+      <w:tr>
+        <w:tc>
+          <w:tcPr>
+            <w:tcW w:w="704" w:type="dxa"/>
+          </w:tcPr>
+          <w:p>
+            <w:pPr>
+              <w:rPr>
+                <w:lang w:val="en-AU" w:eastAsia="ko-KR"/>
+              </w:rPr>
+            </w:pPr>
+            <w:r>
+              <w:rPr>
+                <w:lang w:val="en-AU" w:eastAsia="ko-KR"/>
+              </w:rPr>
+              <w:t>UC4</w:t>
+            </w:r>
+          </w:p>
+        </w:tc>
+        <w:tc>
+          <w:tcPr>
+            <w:tcW w:w="1276" w:type="dxa"/>
+          </w:tcPr>
+          <w:p>
+            <w:pPr>
+              <w:rPr>
+                <w:lang w:val="en-AU" w:eastAsia="ko-KR"/>
+              </w:rPr>
+            </w:pPr>
+            <w:proofErr w:type="gramStart"/>
+            <w:r>
+              <w:rPr>
+                <w:lang w:val="en-AU" w:eastAsia="ko-KR"/>
+              </w:rPr>
+              <w:t>reporting.vw</w:t>
+            </w:r>
+            <w:proofErr w:type="gramEnd"/>
+            <w:r>
+              <w:rPr>
+                <w:lang w:val="en-AU" w:eastAsia="ko-KR"/>
+              </w:rPr>
+              <w:t>_uc4_care_path_breaks</w:t>
+            </w:r>
+          </w:p>
+        </w:tc>
+        <w:tc>
+          <w:tcPr>
+            <w:tcW w:w="3004" w:type="dxa"/>
+          </w:tcPr>
+          <w:p>
+            <w:pPr>
+              <w:rPr>
+                <w:lang w:val="en-AU" w:eastAsia="ko-KR"/>
+              </w:rPr>
+            </w:pPr>
+            <w:r>
+              <w:rPr>
+                <w:lang w:val="en-AU" w:eastAsia="ko-KR"/>
+              </w:rPr>
+              <w:t>Column chart: number of breaks per break type, plus the full listing table beneath it (only 2 rows, so the table carries the detail)</w:t>
+            </w:r>
+          </w:p>
+        </w:tc>
+        <w:tc>
+          <w:tcPr>
+            <w:tcW w:w="1886" w:type="dxa"/>
+          </w:tcPr>
+          <w:p>
+            <w:pPr>
+              <w:rPr>
+                <w:lang w:val="en-AU" w:eastAsia="ko-KR"/>
+              </w:rPr>
+            </w:pPr>
+            <w:proofErr w:type="spellStart"/>
+            <w:r>
+              <w:rPr>
+                <w:lang w:val="en-AU" w:eastAsia="ko-KR"/>
+              </w:rPr>
+              <w:t>break_type</w:t>
+            </w:r>
+            <w:proofErr w:type="spellEnd"/>
+            <w:r>
+              <w:rPr>
+                <w:lang w:val="en-AU" w:eastAsia="ko-KR"/>
+              </w:rPr>
+              <w:t xml:space="preserve"> (category), count of </w:t>
+            </w:r>
+            <w:proofErr w:type="spellStart"/>
+            <w:r>
+              <w:rPr>
+                <w:lang w:val="en-AU" w:eastAsia="ko-KR"/>
+              </w:rPr>
+              <w:t>patient_id</w:t>
+            </w:r>
+            <w:proofErr w:type="spellEnd"/>
+            <w:r>
+              <w:rPr>
+                <w:lang w:val="en-AU" w:eastAsia="ko-KR"/>
+              </w:rPr>
+              <w:t xml:space="preserve"> (value); </w:t>
+            </w:r>
+            <w:proofErr w:type="spellStart"/>
+            <w:r>
+              <w:rPr>
+                <w:lang w:val="en-AU" w:eastAsia="ko-KR"/>
+              </w:rPr>
+              <w:t>display_name</w:t>
+            </w:r>
+            <w:proofErr w:type="spellEnd"/>
+            <w:r>
+              <w:rPr>
+                <w:lang w:val="en-AU" w:eastAsia="ko-KR"/>
+              </w:rPr>
+              <w:t xml:space="preserve">, detail, </w:t>
+            </w:r>
+            <w:proofErr w:type="spellStart"/>
+            <w:r>
+              <w:rPr>
+                <w:lang w:val="en-AU" w:eastAsia="ko-KR"/>
+              </w:rPr>
+              <w:t>event_date</w:t>
+            </w:r>
+            <w:proofErr w:type="spellEnd"/>
+            <w:r>
+              <w:rPr>
+                <w:lang w:val="en-AU" w:eastAsia="ko-KR"/>
+              </w:rPr>
+              <w:t xml:space="preserve"> in the table </w:t>
+            </w:r>
+          </w:p>
+        </w:tc>
+        <w:tc>
+          <w:tcPr>
+            <w:tcW w:w="2146" w:type="dxa"/>
+          </w:tcPr>
+          <w:p>
+            <w:pPr>
+              <w:rPr>
+                <w:rFonts w:ascii="Segoe UI Symbol" w:hAnsi="Segoe UI Symbol" w:cs="Segoe UI Symbol"/>
+                <w:lang w:val="en-AU" w:eastAsia="ko-KR"/>
+              </w:rPr>
+            </w:pPr>
+            <w:r>
+              <w:rPr>
+                <w:lang w:val="en-AU" w:eastAsia="ko-KR"/>
+              </w:rPr>
+              <w:t xml:space="preserve">2 rows: RESULT_NOT_RETURNED 1 (Olivia Brown, OBS-0010), MULTI_PHARMACY_OVERLAP 1 (James Wilson, biguanide) </w:t>
+            </w:r>
+          </w:p>
+        </w:tc>
+      </w:tr>
+    </w:tbl>
+    <w:p>
+      <w:pPr>
+        <w:rPr>
+          <w:rFonts w:ascii="Segoe UI Symbol" w:hAnsi="Segoe UI Symbol" w:cs="Segoe UI Symbol"/>
+          <w:lang w:val="en-AU" w:eastAsia="ko-KR"/>
+        </w:rPr>
+      </w:pPr>
+    </w:p>
+    <w:p>
+      <w:pPr>
+        <w:rPr>
+          <w:lang w:val="en-AU" w:eastAsia="ko-KR"/>
+        </w:rPr>
+      </w:pPr>
+      <w:r>
+        <w:rPr>
+          <w:lang w:val="en-AU" w:eastAsia="ko-KR"/>
+        </w:rPr>
+        <w:t>Each chart sheet carries a caption with the database name, export timestamp and frozen commit from the Control sheet.</w:t>
+      </w:r>
+    </w:p>
+    <w:p>
+      <w:pPr>
+        <w:pStyle w:val="Heading1"/>
+        <w:rPr>
+          <w:rFonts w:ascii="Calibri" w:hAnsi="Calibri" w:cs="Calibri"/>
+          <w:b/>
+          <w:bCs/>
+          <w:color w:val="000000" w:themeColor="text1"/>
+          <w:sz w:val="30"/>
+          <w:szCs w:val="30"/>
+        </w:rPr>
+      </w:pPr>
+      <w:r>
+        <w:rPr>
+          <w:rFonts w:ascii="Calibri" w:hAnsi="Calibri" w:cs="Calibri"/>
+          <w:b/>
+          <w:bCs/>
+          <w:color w:val="000000" w:themeColor="text1"/>
+          <w:sz w:val="30"/>
+          <w:szCs w:val="30"/>
+        </w:rPr>
+        <w:lastRenderedPageBreak/>
+        <w:t>6</w:t>
       </w:r>
       <w:r>
         <w:rPr>
@@ -1487,7 +2866,6 @@
     <w:p>
       <w:pPr>
         <w:rPr>
-          <w:rFonts w:hint="eastAsia"/>
           <w:lang w:val="en-AU"/>
         </w:rPr>
       </w:pPr>
@@ -2497,6 +3875,25 @@
       <w:spacing w:val="5"/>
     </w:rPr>
   </w:style>
+  <w:style w:type="table" w:styleId="TableGrid">
+    <w:name w:val="Table Grid"/>
+    <w:basedOn w:val="TableNormal"/>
+    <w:uiPriority w:val="39"/>
+    <w:rsid w:val="00556CEC"/>
+    <w:pPr>
+      <w:spacing w:after="0" w:line="240" w:lineRule="auto"/>
+    </w:pPr>
+    <w:tblPr>
+      <w:tblBorders>
+        <w:top w:val="single" w:sz="4" w:space="0" w:color="auto"/>
+        <w:left w:val="single" w:sz="4" w:space="0" w:color="auto"/>
+        <w:bottom w:val="single" w:sz="4" w:space="0" w:color="auto"/>
+        <w:right w:val="single" w:sz="4" w:space="0" w:color="auto"/>
+        <w:insideH w:val="single" w:sz="4" w:space="0" w:color="auto"/>
+        <w:insideV w:val="single" w:sz="4" w:space="0" w:color="auto"/>
+      </w:tblBorders>
+    </w:tblPr>
+  </w:style>
 </w:styles>
 </file>
 

</xml_diff>

<commit_message>
F/test plan fix (#12)
* feat: excel updated

* f: dashboard options updated - add our decision, our chart plan

* feat: vw_uc2 updated in UC2

* feat: vw_uc2 evidence added

* feat: 09_tests.sql added

* feat: video outline
</commit_message>
<xml_diff>
--- a/docs/dashboard_options.docx
+++ b/docs/dashboard_options.docx
@@ -57,7 +57,6 @@
       <w:pPr>
         <w:spacing w:after="100"/>
         <w:rPr>
-          <w:rFonts w:hint="eastAsia"/>
           <w:color w:val="000000" w:themeColor="text1"/>
           <w:lang w:eastAsia="ko-KR"/>
         </w:rPr>
@@ -92,21 +91,26 @@
         </w:rPr>
         <w:t xml:space="preserve">) · Reviewers: </w:t>
       </w:r>
-      <w:proofErr w:type="spellStart"/>
       <w:r>
         <w:rPr>
           <w:color w:val="000000" w:themeColor="text1"/>
           <w:lang w:eastAsia="ko-KR"/>
         </w:rPr>
-        <w:t>Xialong</w:t>
-      </w:r>
-      <w:proofErr w:type="spellEnd"/>
+        <w:t>Xia</w:t>
+      </w:r>
       <w:r>
         <w:rPr>
           <w:color w:val="000000" w:themeColor="text1"/>
           <w:lang w:eastAsia="ko-KR"/>
         </w:rPr>
-        <w:t xml:space="preserve"> Yang (A), Zhihao Zhang</w:t>
+        <w:t>o</w:t>
+      </w:r>
+      <w:r>
+        <w:rPr>
+          <w:color w:val="000000" w:themeColor="text1"/>
+          <w:lang w:eastAsia="ko-KR"/>
+        </w:rPr>
+        <w:t>long Yang (A), Zhihao Zhang</w:t>
       </w:r>
       <w:r>
         <w:rPr>
@@ -875,13 +879,6 @@
     </w:p>
     <w:p>
       <w:pPr>
-        <w:rPr>
-          <w:lang w:val="en-AU" w:eastAsia="ko-KR"/>
-        </w:rPr>
-      </w:pPr>
-    </w:p>
-    <w:p>
-      <w:pPr>
         <w:pStyle w:val="Heading1"/>
         <w:rPr>
           <w:rFonts w:ascii="Calibri" w:hAnsi="Calibri" w:cs="Calibri"/>
@@ -902,6 +899,1388 @@
           <w:szCs w:val="30"/>
         </w:rPr>
         <w:t>4</w:t>
+      </w:r>
+      <w:r>
+        <w:rPr>
+          <w:rFonts w:ascii="Calibri" w:hAnsi="Calibri" w:cs="Calibri"/>
+          <w:b/>
+          <w:bCs/>
+          <w:color w:val="000000" w:themeColor="text1"/>
+          <w:sz w:val="30"/>
+          <w:szCs w:val="30"/>
+        </w:rPr>
+        <w:t xml:space="preserve">. </w:t>
+      </w:r>
+      <w:r>
+        <w:rPr>
+          <w:rFonts w:ascii="Calibri" w:hAnsi="Calibri" w:cs="Calibri"/>
+          <w:b/>
+          <w:bCs/>
+          <w:color w:val="000000" w:themeColor="text1"/>
+          <w:sz w:val="30"/>
+          <w:szCs w:val="30"/>
+        </w:rPr>
+        <w:t>Decision</w:t>
+      </w:r>
+    </w:p>
+    <w:p>
+      <w:pPr>
+        <w:rPr>
+          <w:lang w:val="en-AU" w:eastAsia="ko-KR"/>
+        </w:rPr>
+      </w:pPr>
+      <w:r>
+        <w:rPr>
+          <w:b/>
+          <w:bCs/>
+          <w:lang w:val="en-AU" w:eastAsia="ko-KR"/>
+        </w:rPr>
+        <w:t>Decision</w:t>
+      </w:r>
+      <w:r>
+        <w:rPr>
+          <w:lang w:val="en-AU" w:eastAsia="ko-KR"/>
+        </w:rPr>
+        <w:t xml:space="preserve">: Excel charts from exported view results. </w:t>
+      </w:r>
+      <w:proofErr w:type="spellStart"/>
+      <w:r>
+        <w:rPr>
+          <w:lang w:val="en-AU" w:eastAsia="ko-KR"/>
+        </w:rPr>
+        <w:t>Metabase</w:t>
+      </w:r>
+      <w:proofErr w:type="spellEnd"/>
+      <w:r>
+        <w:rPr>
+          <w:lang w:val="en-AU" w:eastAsia="ko-KR"/>
+        </w:rPr>
+        <w:t xml:space="preserve"> is not used</w:t>
+      </w:r>
+      <w:r>
+        <w:rPr>
+          <w:lang w:val="en-AU" w:eastAsia="ko-KR"/>
+        </w:rPr>
+        <w:t xml:space="preserve"> </w:t>
+      </w:r>
+      <w:r>
+        <w:rPr>
+          <w:lang w:val="en-AU" w:eastAsia="ko-KR"/>
+        </w:rPr>
+        <w:t>(confirmed by Xiaolong Yang, Thu 9 Oct, Teams; Zhihao Zhang's B-4 handoff in</w:t>
+      </w:r>
+      <w:r>
+        <w:rPr>
+          <w:lang w:val="en-AU" w:eastAsia="ko-KR"/>
+        </w:rPr>
+        <w:t xml:space="preserve"> </w:t>
+      </w:r>
+      <w:r>
+        <w:rPr>
+          <w:lang w:val="en-AU" w:eastAsia="ko-KR"/>
+        </w:rPr>
+        <w:t>docs/</w:t>
+      </w:r>
+      <w:proofErr w:type="spellStart"/>
+      <w:r>
+        <w:rPr>
+          <w:lang w:val="en-AU" w:eastAsia="ko-KR"/>
+        </w:rPr>
+        <w:t>excel_reporting</w:t>
+      </w:r>
+      <w:proofErr w:type="spellEnd"/>
+      <w:r>
+        <w:rPr>
+          <w:lang w:val="en-AU" w:eastAsia="ko-KR"/>
+        </w:rPr>
+        <w:t>/).</w:t>
+      </w:r>
+    </w:p>
+    <w:p>
+      <w:pPr>
+        <w:rPr>
+          <w:lang w:val="en-AU" w:eastAsia="ko-KR"/>
+        </w:rPr>
+      </w:pPr>
+    </w:p>
+    <w:p>
+      <w:pPr>
+        <w:rPr>
+          <w:lang w:val="en-AU" w:eastAsia="ko-KR"/>
+        </w:rPr>
+      </w:pPr>
+      <w:r>
+        <w:rPr>
+          <w:b/>
+          <w:bCs/>
+          <w:lang w:val="en-AU" w:eastAsia="ko-KR"/>
+        </w:rPr>
+        <w:t>Reason</w:t>
+      </w:r>
+      <w:r>
+        <w:rPr>
+          <w:lang w:val="en-AU" w:eastAsia="ko-KR"/>
+        </w:rPr>
+        <w:t xml:space="preserve">: </w:t>
+      </w:r>
+      <w:proofErr w:type="spellStart"/>
+      <w:r>
+        <w:rPr>
+          <w:lang w:val="en-AU" w:eastAsia="ko-KR"/>
+        </w:rPr>
+        <w:t>Metabase</w:t>
+      </w:r>
+      <w:proofErr w:type="spellEnd"/>
+      <w:r>
+        <w:rPr>
+          <w:lang w:val="en-AU" w:eastAsia="ko-KR"/>
+        </w:rPr>
+        <w:t xml:space="preserve"> was not fully deployed and validated on the shared</w:t>
+      </w:r>
+      <w:r>
+        <w:rPr>
+          <w:lang w:val="en-AU" w:eastAsia="ko-KR"/>
+        </w:rPr>
+        <w:t xml:space="preserve"> </w:t>
+      </w:r>
+      <w:r>
+        <w:rPr>
+          <w:lang w:val="en-AU" w:eastAsia="ko-KR"/>
+        </w:rPr>
+        <w:t>server. Completing another service, its HTTPS route, a read-only connection</w:t>
+      </w:r>
+      <w:r>
+        <w:rPr>
+          <w:lang w:val="en-AU" w:eastAsia="ko-KR"/>
+        </w:rPr>
+        <w:t xml:space="preserve"> </w:t>
+      </w:r>
+      <w:r>
+        <w:rPr>
+          <w:lang w:val="en-AU" w:eastAsia="ko-KR"/>
+        </w:rPr>
+        <w:t>and the permission checks would take time away from the 00</w:t>
+      </w:r>
+      <w:r>
+        <w:rPr>
+          <w:rFonts w:hint="eastAsia"/>
+          <w:lang w:val="en-AU" w:eastAsia="ko-KR"/>
+        </w:rPr>
+        <w:t>→</w:t>
+      </w:r>
+      <w:r>
+        <w:rPr>
+          <w:lang w:val="en-AU" w:eastAsia="ko-KR"/>
+        </w:rPr>
+        <w:t>10 integration.</w:t>
+      </w:r>
+      <w:r>
+        <w:rPr>
+          <w:lang w:val="en-AU" w:eastAsia="ko-KR"/>
+        </w:rPr>
+        <w:t xml:space="preserve"> </w:t>
+      </w:r>
+      <w:r>
+        <w:rPr>
+          <w:lang w:val="en-AU" w:eastAsia="ko-KR"/>
+        </w:rPr>
+        <w:t xml:space="preserve">Excel uses </w:t>
+      </w:r>
+      <w:proofErr w:type="gramStart"/>
+      <w:r>
+        <w:rPr>
+          <w:lang w:val="en-AU" w:eastAsia="ko-KR"/>
+        </w:rPr>
+        <w:t>exactly the same</w:t>
+      </w:r>
+      <w:proofErr w:type="gramEnd"/>
+      <w:r>
+        <w:rPr>
+          <w:lang w:val="en-AU" w:eastAsia="ko-KR"/>
+        </w:rPr>
+        <w:t xml:space="preserve"> reporting SQL results, needs no new</w:t>
+      </w:r>
+      <w:r>
+        <w:rPr>
+          <w:lang w:val="en-AU" w:eastAsia="ko-KR"/>
+        </w:rPr>
+        <w:t xml:space="preserve"> </w:t>
+      </w:r>
+      <w:r>
+        <w:rPr>
+          <w:lang w:val="en-AU" w:eastAsia="ko-KR"/>
+        </w:rPr>
+        <w:t xml:space="preserve">infrastructure, and the existing </w:t>
+      </w:r>
+      <w:proofErr w:type="spellStart"/>
+      <w:r>
+        <w:rPr>
+          <w:lang w:val="en-AU" w:eastAsia="ko-KR"/>
+        </w:rPr>
+        <w:t>CloudBeaver</w:t>
+      </w:r>
+      <w:proofErr w:type="spellEnd"/>
+      <w:r>
+        <w:rPr>
+          <w:lang w:val="en-AU" w:eastAsia="ko-KR"/>
+        </w:rPr>
+        <w:t xml:space="preserve"> login is enough.</w:t>
+      </w:r>
+    </w:p>
+    <w:p>
+      <w:pPr>
+        <w:rPr>
+          <w:rFonts w:ascii="Segoe UI Symbol" w:hAnsi="Segoe UI Symbol" w:cs="Segoe UI Symbol"/>
+          <w:lang w:val="en-AU" w:eastAsia="ko-KR"/>
+        </w:rPr>
+      </w:pPr>
+    </w:p>
+    <w:p>
+      <w:pPr>
+        <w:rPr>
+          <w:lang w:val="en-AU" w:eastAsia="ko-KR"/>
+        </w:rPr>
+      </w:pPr>
+      <w:r>
+        <w:rPr>
+          <w:b/>
+          <w:bCs/>
+          <w:lang w:val="en-AU" w:eastAsia="ko-KR"/>
+        </w:rPr>
+        <w:t>How it works</w:t>
+      </w:r>
+      <w:r>
+        <w:rPr>
+          <w:lang w:val="en-AU" w:eastAsia="ko-KR"/>
+        </w:rPr>
+        <w:t>: B's template B_Reporting_Export_20261007.xlsx (Control, Checks,</w:t>
+      </w:r>
+      <w:r>
+        <w:rPr>
+          <w:lang w:val="en-AU" w:eastAsia="ko-KR"/>
+        </w:rPr>
+        <w:t xml:space="preserve"> </w:t>
+      </w:r>
+      <w:r>
+        <w:rPr>
+          <w:lang w:val="en-AU" w:eastAsia="ko-KR"/>
+        </w:rPr>
+        <w:t>Queries, UC1–UC4 sheets) is copied by F and never edited in the original. As</w:t>
+      </w:r>
+      <w:r>
+        <w:rPr>
+          <w:lang w:val="en-AU" w:eastAsia="ko-KR"/>
+        </w:rPr>
+        <w:t xml:space="preserve"> </w:t>
+      </w:r>
+      <w:r>
+        <w:rPr>
+          <w:lang w:val="en-AU" w:eastAsia="ko-KR"/>
+        </w:rPr>
+        <w:t>each view is accepted (vw_uc2 Fri 18:00, vw_uc1/vw_uc3 Fri 21:00, vw_uc4 Sat</w:t>
+      </w:r>
+      <w:r>
+        <w:rPr>
+          <w:lang w:val="en-AU" w:eastAsia="ko-KR"/>
+        </w:rPr>
+        <w:t xml:space="preserve"> </w:t>
+      </w:r>
+      <w:r>
+        <w:rPr>
+          <w:lang w:val="en-AU" w:eastAsia="ko-KR"/>
+        </w:rPr>
+        <w:t xml:space="preserve">12:00), F runs the Queries-sheet SELECT in </w:t>
+      </w:r>
+      <w:proofErr w:type="spellStart"/>
+      <w:r>
+        <w:rPr>
+          <w:lang w:val="en-AU" w:eastAsia="ko-KR"/>
+        </w:rPr>
+        <w:t>CloudBeaver</w:t>
+      </w:r>
+      <w:proofErr w:type="spellEnd"/>
+      <w:r>
+        <w:rPr>
+          <w:lang w:val="en-AU" w:eastAsia="ko-KR"/>
+        </w:rPr>
+        <w:t>, exports CSV (UTF-8,</w:t>
+      </w:r>
+      <w:r>
+        <w:rPr>
+          <w:lang w:val="en-AU" w:eastAsia="ko-KR"/>
+        </w:rPr>
+        <w:t xml:space="preserve"> </w:t>
+      </w:r>
+      <w:r>
+        <w:rPr>
+          <w:lang w:val="en-AU" w:eastAsia="ko-KR"/>
+        </w:rPr>
+        <w:t>header, NULL empty), pastes it into the matching sheet and completes Checks</w:t>
+      </w:r>
+      <w:r>
+        <w:rPr>
+          <w:lang w:val="en-AU" w:eastAsia="ko-KR"/>
+        </w:rPr>
+        <w:t xml:space="preserve"> </w:t>
+      </w:r>
+      <w:r>
+        <w:rPr>
+          <w:lang w:val="en-AU" w:eastAsia="ko-KR"/>
+        </w:rPr>
+        <w:t>(row counts 8 / 11 / 16 / 2 and status counts). Views not yet accepted stay</w:t>
+      </w:r>
+      <w:r>
+        <w:rPr>
+          <w:lang w:val="en-AU" w:eastAsia="ko-KR"/>
+        </w:rPr>
+        <w:t xml:space="preserve"> </w:t>
+      </w:r>
+      <w:r>
+        <w:rPr>
+          <w:lang w:val="en-AU" w:eastAsia="ko-KR"/>
+        </w:rPr>
+        <w:t>marked PENDING in Control. The workbook is a snapshot: after any pipeline</w:t>
+      </w:r>
+      <w:r>
+        <w:rPr>
+          <w:lang w:val="en-AU" w:eastAsia="ko-KR"/>
+        </w:rPr>
+        <w:t xml:space="preserve"> </w:t>
+      </w:r>
+      <w:r>
+        <w:rPr>
+          <w:lang w:val="en-AU" w:eastAsia="ko-KR"/>
+        </w:rPr>
+        <w:t>rerun or parameter change all affected CSVs are re-exported and Checks</w:t>
+      </w:r>
+    </w:p>
+    <w:p>
+      <w:pPr>
+        <w:rPr>
+          <w:lang w:val="en-AU" w:eastAsia="ko-KR"/>
+        </w:rPr>
+      </w:pPr>
+      <w:r>
+        <w:rPr>
+          <w:lang w:val="en-AU" w:eastAsia="ko-KR"/>
+        </w:rPr>
+        <w:lastRenderedPageBreak/>
+        <w:t xml:space="preserve">repeated before the charts are published. </w:t>
+      </w:r>
+      <w:proofErr w:type="spellStart"/>
+      <w:r>
+        <w:rPr>
+          <w:lang w:val="en-AU" w:eastAsia="ko-KR"/>
+        </w:rPr>
+        <w:t>export_reporting.sql</w:t>
+      </w:r>
+      <w:proofErr w:type="spellEnd"/>
+      <w:r>
+        <w:rPr>
+          <w:lang w:val="en-AU" w:eastAsia="ko-KR"/>
+        </w:rPr>
+        <w:t xml:space="preserve"> is run by B</w:t>
+      </w:r>
+      <w:r>
+        <w:rPr>
+          <w:lang w:val="en-AU" w:eastAsia="ko-KR"/>
+        </w:rPr>
+        <w:t xml:space="preserve"> </w:t>
+      </w:r>
+      <w:r>
+        <w:rPr>
+          <w:lang w:val="en-AU" w:eastAsia="ko-KR"/>
+        </w:rPr>
+        <w:t xml:space="preserve">only, with </w:t>
+      </w:r>
+      <w:proofErr w:type="spellStart"/>
+      <w:r>
+        <w:rPr>
+          <w:lang w:val="en-AU" w:eastAsia="ko-KR"/>
+        </w:rPr>
+        <w:t>psql</w:t>
+      </w:r>
+      <w:proofErr w:type="spellEnd"/>
+      <w:r>
+        <w:rPr>
+          <w:lang w:val="en-AU" w:eastAsia="ko-KR"/>
+        </w:rPr>
+        <w:t>, once all four views are accepted, to produce one consistent</w:t>
+      </w:r>
+      <w:r>
+        <w:rPr>
+          <w:lang w:val="en-AU" w:eastAsia="ko-KR"/>
+        </w:rPr>
+        <w:t xml:space="preserve"> </w:t>
+      </w:r>
+      <w:r>
+        <w:rPr>
+          <w:lang w:val="en-AU" w:eastAsia="ko-KR"/>
+        </w:rPr>
+        <w:t>snapshot (uc1–uc4.csv + export_metadata.csv).</w:t>
+      </w:r>
+    </w:p>
+    <w:p>
+      <w:pPr>
+        <w:rPr>
+          <w:lang w:val="en-AU" w:eastAsia="ko-KR"/>
+        </w:rPr>
+      </w:pPr>
+    </w:p>
+    <w:p>
+      <w:pPr>
+        <w:rPr>
+          <w:lang w:val="en-AU" w:eastAsia="ko-KR"/>
+        </w:rPr>
+      </w:pPr>
+      <w:r>
+        <w:rPr>
+          <w:b/>
+          <w:bCs/>
+          <w:lang w:val="en-AU" w:eastAsia="ko-KR"/>
+        </w:rPr>
+        <w:t>Limitation accepted</w:t>
+      </w:r>
+      <w:r>
+        <w:rPr>
+          <w:lang w:val="en-AU" w:eastAsia="ko-KR"/>
+        </w:rPr>
+        <w:t xml:space="preserve">: charts are static. For the demo video the </w:t>
+      </w:r>
+      <w:proofErr w:type="spellStart"/>
+      <w:proofErr w:type="gramStart"/>
+      <w:r>
+        <w:rPr>
+          <w:lang w:val="en-AU" w:eastAsia="ko-KR"/>
+        </w:rPr>
+        <w:t>CloudBeaver</w:t>
+      </w:r>
+      <w:proofErr w:type="spellEnd"/>
+      <w:r>
+        <w:rPr>
+          <w:lang w:val="en-AU" w:eastAsia="ko-KR"/>
+        </w:rPr>
+        <w:t xml:space="preserve"> </w:t>
+      </w:r>
+      <w:r>
+        <w:rPr>
+          <w:lang w:val="en-AU" w:eastAsia="ko-KR"/>
+        </w:rPr>
+        <w:t xml:space="preserve"> </w:t>
+      </w:r>
+      <w:r>
+        <w:rPr>
+          <w:lang w:val="en-AU" w:eastAsia="ko-KR"/>
+        </w:rPr>
+        <w:t>query</w:t>
+      </w:r>
+      <w:proofErr w:type="gramEnd"/>
+      <w:r>
+        <w:rPr>
+          <w:lang w:val="en-AU" w:eastAsia="ko-KR"/>
+        </w:rPr>
+        <w:t xml:space="preserve"> result and the Excel chart are shown side by side to evidence that the chart reflects the live view.</w:t>
+      </w:r>
+    </w:p>
+    <w:p>
+      <w:pPr>
+        <w:pStyle w:val="Heading1"/>
+        <w:rPr>
+          <w:rFonts w:ascii="Calibri" w:hAnsi="Calibri" w:cs="Calibri"/>
+          <w:b/>
+          <w:bCs/>
+          <w:color w:val="000000" w:themeColor="text1"/>
+          <w:sz w:val="30"/>
+          <w:szCs w:val="30"/>
+        </w:rPr>
+      </w:pPr>
+      <w:r>
+        <w:rPr>
+          <w:rFonts w:ascii="Calibri" w:hAnsi="Calibri" w:cs="Calibri"/>
+          <w:b/>
+          <w:bCs/>
+          <w:color w:val="000000" w:themeColor="text1"/>
+          <w:sz w:val="30"/>
+          <w:szCs w:val="30"/>
+        </w:rPr>
+        <w:t>5</w:t>
+      </w:r>
+      <w:r>
+        <w:rPr>
+          <w:rFonts w:ascii="Calibri" w:hAnsi="Calibri" w:cs="Calibri"/>
+          <w:b/>
+          <w:bCs/>
+          <w:color w:val="000000" w:themeColor="text1"/>
+          <w:sz w:val="30"/>
+          <w:szCs w:val="30"/>
+        </w:rPr>
+        <w:t xml:space="preserve">. </w:t>
+      </w:r>
+      <w:r>
+        <w:rPr>
+          <w:rFonts w:ascii="Calibri" w:hAnsi="Calibri" w:cs="Calibri"/>
+          <w:b/>
+          <w:bCs/>
+          <w:color w:val="000000" w:themeColor="text1"/>
+          <w:sz w:val="30"/>
+          <w:szCs w:val="30"/>
+        </w:rPr>
+        <w:t>Chart plan</w:t>
+      </w:r>
+    </w:p>
+    <w:p>
+      <w:pPr>
+        <w:rPr>
+          <w:lang w:val="en-AU" w:eastAsia="ko-KR"/>
+        </w:rPr>
+      </w:pPr>
+      <w:r>
+        <w:rPr>
+          <w:lang w:val="en-AU" w:eastAsia="ko-KR"/>
+        </w:rPr>
+        <w:t xml:space="preserve">Charts use only the statuses and values supplied by the views; no business rule is re-implemented in Excel. </w:t>
+      </w:r>
+    </w:p>
+    <w:p>
+      <w:pPr>
+        <w:rPr>
+          <w:lang w:val="en-AU" w:eastAsia="ko-KR"/>
+        </w:rPr>
+      </w:pPr>
+    </w:p>
+    <w:tbl>
+      <w:tblPr>
+        <w:tblStyle w:val="TableGrid"/>
+        <w:tblW w:w="0" w:type="auto"/>
+        <w:tblLayout w:type="fixed"/>
+        <w:tblLook w:val="04A0" w:firstRow="1" w:lastRow="0" w:firstColumn="1" w:lastColumn="0" w:noHBand="0" w:noVBand="1"/>
+      </w:tblPr>
+      <w:tblGrid>
+        <w:gridCol w:w="704"/>
+        <w:gridCol w:w="1276"/>
+        <w:gridCol w:w="3004"/>
+        <w:gridCol w:w="1886"/>
+        <w:gridCol w:w="2146"/>
+      </w:tblGrid>
+      <w:tr>
+        <w:tc>
+          <w:tcPr>
+            <w:tcW w:w="704" w:type="dxa"/>
+            <w:shd w:val="clear" w:color="auto" w:fill="BFBFBF" w:themeFill="background1" w:themeFillShade="BF"/>
+          </w:tcPr>
+          <w:p>
+            <w:pPr>
+              <w:rPr>
+                <w:lang w:val="en-AU" w:eastAsia="ko-KR"/>
+              </w:rPr>
+            </w:pPr>
+            <w:r>
+              <w:rPr>
+                <w:lang w:val="en-AU" w:eastAsia="ko-KR"/>
+              </w:rPr>
+              <w:t>Use case</w:t>
+            </w:r>
+          </w:p>
+        </w:tc>
+        <w:tc>
+          <w:tcPr>
+            <w:tcW w:w="1276" w:type="dxa"/>
+            <w:shd w:val="clear" w:color="auto" w:fill="BFBFBF" w:themeFill="background1" w:themeFillShade="BF"/>
+          </w:tcPr>
+          <w:p>
+            <w:pPr>
+              <w:rPr>
+                <w:lang w:val="en-AU" w:eastAsia="ko-KR"/>
+              </w:rPr>
+            </w:pPr>
+            <w:r>
+              <w:rPr>
+                <w:lang w:val="en-AU" w:eastAsia="ko-KR"/>
+              </w:rPr>
+              <w:t>View</w:t>
+            </w:r>
+          </w:p>
+        </w:tc>
+        <w:tc>
+          <w:tcPr>
+            <w:tcW w:w="3004" w:type="dxa"/>
+            <w:shd w:val="clear" w:color="auto" w:fill="BFBFBF" w:themeFill="background1" w:themeFillShade="BF"/>
+          </w:tcPr>
+          <w:p>
+            <w:pPr>
+              <w:rPr>
+                <w:lang w:val="en-AU" w:eastAsia="ko-KR"/>
+              </w:rPr>
+            </w:pPr>
+            <w:r>
+              <w:rPr>
+                <w:lang w:val="en-AU" w:eastAsia="ko-KR"/>
+              </w:rPr>
+              <w:t>Chart type</w:t>
+            </w:r>
+          </w:p>
+        </w:tc>
+        <w:tc>
+          <w:tcPr>
+            <w:tcW w:w="1886" w:type="dxa"/>
+            <w:shd w:val="clear" w:color="auto" w:fill="BFBFBF" w:themeFill="background1" w:themeFillShade="BF"/>
+          </w:tcPr>
+          <w:p>
+            <w:pPr>
+              <w:rPr>
+                <w:lang w:val="en-AU" w:eastAsia="ko-KR"/>
+              </w:rPr>
+            </w:pPr>
+            <w:r>
+              <w:rPr>
+                <w:lang w:val="en-AU" w:eastAsia="ko-KR"/>
+              </w:rPr>
+              <w:t>Columns used</w:t>
+            </w:r>
+          </w:p>
+        </w:tc>
+        <w:tc>
+          <w:tcPr>
+            <w:tcW w:w="2146" w:type="dxa"/>
+            <w:shd w:val="clear" w:color="auto" w:fill="BFBFBF" w:themeFill="background1" w:themeFillShade="BF"/>
+          </w:tcPr>
+          <w:p>
+            <w:pPr>
+              <w:rPr>
+                <w:lang w:val="en-AU" w:eastAsia="ko-KR"/>
+              </w:rPr>
+            </w:pPr>
+            <w:r>
+              <w:rPr>
+                <w:lang w:val="en-AU" w:eastAsia="ko-KR"/>
+              </w:rPr>
+              <w:t>Expected result</w:t>
+            </w:r>
+          </w:p>
+        </w:tc>
+      </w:tr>
+      <w:tr>
+        <w:tc>
+          <w:tcPr>
+            <w:tcW w:w="704" w:type="dxa"/>
+          </w:tcPr>
+          <w:p>
+            <w:pPr>
+              <w:rPr>
+                <w:lang w:val="en-AU" w:eastAsia="ko-KR"/>
+              </w:rPr>
+            </w:pPr>
+            <w:r>
+              <w:rPr>
+                <w:lang w:val="en-AU" w:eastAsia="ko-KR"/>
+              </w:rPr>
+              <w:t>UC1</w:t>
+            </w:r>
+          </w:p>
+        </w:tc>
+        <w:tc>
+          <w:tcPr>
+            <w:tcW w:w="1276" w:type="dxa"/>
+          </w:tcPr>
+          <w:p>
+            <w:pPr>
+              <w:rPr>
+                <w:lang w:val="en-AU" w:eastAsia="ko-KR"/>
+              </w:rPr>
+            </w:pPr>
+            <w:proofErr w:type="gramStart"/>
+            <w:r>
+              <w:rPr>
+                <w:lang w:val="en-AU" w:eastAsia="ko-KR"/>
+              </w:rPr>
+              <w:t>reporting.vw</w:t>
+            </w:r>
+            <w:proofErr w:type="gramEnd"/>
+            <w:r>
+              <w:rPr>
+                <w:lang w:val="en-AU" w:eastAsia="ko-KR"/>
+              </w:rPr>
+              <w:t>_uc1_care_gaps</w:t>
+            </w:r>
+            <w:r>
+              <w:rPr>
+                <w:lang w:val="en-AU" w:eastAsia="ko-KR"/>
+              </w:rPr>
+              <w:t xml:space="preserve"> </w:t>
+            </w:r>
+          </w:p>
+        </w:tc>
+        <w:tc>
+          <w:tcPr>
+            <w:tcW w:w="3004" w:type="dxa"/>
+          </w:tcPr>
+          <w:p>
+            <w:pPr>
+              <w:rPr>
+                <w:lang w:val="en-AU" w:eastAsia="ko-KR"/>
+              </w:rPr>
+            </w:pPr>
+            <w:r>
+              <w:rPr>
+                <w:lang w:val="en-AU" w:eastAsia="ko-KR"/>
+              </w:rPr>
+              <w:t>Clustered column chart: number of patients per care-gap status</w:t>
+            </w:r>
+          </w:p>
+        </w:tc>
+        <w:tc>
+          <w:tcPr>
+            <w:tcW w:w="1886" w:type="dxa"/>
+          </w:tcPr>
+          <w:p>
+            <w:pPr>
+              <w:rPr>
+                <w:lang w:val="en-AU" w:eastAsia="ko-KR"/>
+              </w:rPr>
+            </w:pPr>
+            <w:proofErr w:type="spellStart"/>
+            <w:r>
+              <w:rPr>
+                <w:lang w:val="en-AU" w:eastAsia="ko-KR"/>
+              </w:rPr>
+              <w:t>care_gap_status</w:t>
+            </w:r>
+            <w:proofErr w:type="spellEnd"/>
+            <w:r>
+              <w:rPr>
+                <w:lang w:val="en-AU" w:eastAsia="ko-KR"/>
+              </w:rPr>
+              <w:t xml:space="preserve"> (category), count of </w:t>
+            </w:r>
+            <w:proofErr w:type="spellStart"/>
+            <w:r>
+              <w:rPr>
+                <w:lang w:val="en-AU" w:eastAsia="ko-KR"/>
+              </w:rPr>
+              <w:t>patient_id</w:t>
+            </w:r>
+            <w:proofErr w:type="spellEnd"/>
+            <w:r>
+              <w:rPr>
+                <w:lang w:val="en-AU" w:eastAsia="ko-KR"/>
+              </w:rPr>
+              <w:t xml:space="preserve"> (value); </w:t>
+            </w:r>
+            <w:proofErr w:type="spellStart"/>
+            <w:r>
+              <w:rPr>
+                <w:lang w:val="en-AU" w:eastAsia="ko-KR"/>
+              </w:rPr>
+              <w:t>display_name</w:t>
+            </w:r>
+            <w:proofErr w:type="spellEnd"/>
+            <w:r>
+              <w:rPr>
+                <w:lang w:val="en-AU" w:eastAsia="ko-KR"/>
+              </w:rPr>
+              <w:t xml:space="preserve">, </w:t>
+            </w:r>
+            <w:proofErr w:type="spellStart"/>
+            <w:r>
+              <w:rPr>
+                <w:lang w:val="en-AU" w:eastAsia="ko-KR"/>
+              </w:rPr>
+              <w:t>last_test_date</w:t>
+            </w:r>
+            <w:proofErr w:type="spellEnd"/>
+            <w:r>
+              <w:rPr>
+                <w:lang w:val="en-AU" w:eastAsia="ko-KR"/>
+              </w:rPr>
+              <w:t xml:space="preserve">, last_hba1c_mmol_mol, </w:t>
+            </w:r>
+            <w:proofErr w:type="spellStart"/>
+            <w:r>
+              <w:rPr>
+                <w:lang w:val="en-AU" w:eastAsia="ko-KR"/>
+              </w:rPr>
+              <w:t>first_review_date</w:t>
+            </w:r>
+            <w:proofErr w:type="spellEnd"/>
+            <w:r>
+              <w:rPr>
+                <w:lang w:val="en-AU" w:eastAsia="ko-KR"/>
+              </w:rPr>
+              <w:t xml:space="preserve"> in the supporting table</w:t>
+            </w:r>
+          </w:p>
+        </w:tc>
+        <w:tc>
+          <w:tcPr>
+            <w:tcW w:w="2146" w:type="dxa"/>
+          </w:tcPr>
+          <w:p>
+            <w:pPr>
+              <w:rPr>
+                <w:lang w:val="en-AU" w:eastAsia="ko-KR"/>
+              </w:rPr>
+            </w:pPr>
+            <w:r>
+              <w:rPr>
+                <w:lang w:val="en-AU" w:eastAsia="ko-KR"/>
+              </w:rPr>
+              <w:t>8 patients: HIGH_NO_REVIEW 2, HIGH_REVIEW_PENDING 3, OVERDUE_TEST 2, NO_TEST_ON_RECORD 1</w:t>
+            </w:r>
+          </w:p>
+        </w:tc>
+      </w:tr>
+      <w:tr>
+        <w:tc>
+          <w:tcPr>
+            <w:tcW w:w="704" w:type="dxa"/>
+          </w:tcPr>
+          <w:p>
+            <w:pPr>
+              <w:rPr>
+                <w:lang w:val="en-AU" w:eastAsia="ko-KR"/>
+              </w:rPr>
+            </w:pPr>
+            <w:r>
+              <w:rPr>
+                <w:lang w:val="en-AU" w:eastAsia="ko-KR"/>
+              </w:rPr>
+              <w:t>UC2</w:t>
+            </w:r>
+          </w:p>
+        </w:tc>
+        <w:tc>
+          <w:tcPr>
+            <w:tcW w:w="1276" w:type="dxa"/>
+          </w:tcPr>
+          <w:p>
+            <w:pPr>
+              <w:rPr>
+                <w:lang w:val="en-AU" w:eastAsia="ko-KR"/>
+              </w:rPr>
+            </w:pPr>
+            <w:proofErr w:type="gramStart"/>
+            <w:r>
+              <w:rPr>
+                <w:lang w:val="en-AU" w:eastAsia="ko-KR"/>
+              </w:rPr>
+              <w:t>reporting.vw</w:t>
+            </w:r>
+            <w:proofErr w:type="gramEnd"/>
+            <w:r>
+              <w:rPr>
+                <w:lang w:val="en-AU" w:eastAsia="ko-KR"/>
+              </w:rPr>
+              <w:t>_uc2_pdc</w:t>
+            </w:r>
+          </w:p>
+        </w:tc>
+        <w:tc>
+          <w:tcPr>
+            <w:tcW w:w="3004" w:type="dxa"/>
+          </w:tcPr>
+          <w:p>
+            <w:pPr>
+              <w:rPr>
+                <w:lang w:val="en-AU" w:eastAsia="ko-KR"/>
+              </w:rPr>
+            </w:pPr>
+            <w:r>
+              <w:rPr>
+                <w:lang w:val="en-AU" w:eastAsia="ko-KR"/>
+              </w:rPr>
+              <w:t xml:space="preserve">Horizontal bar chart: PDC per patient, sorted ascending, bars coloured by adherence status, with a vertical reference line at the 0.8 threshold </w:t>
+            </w:r>
+          </w:p>
+        </w:tc>
+        <w:tc>
+          <w:tcPr>
+            <w:tcW w:w="1886" w:type="dxa"/>
+          </w:tcPr>
+          <w:p>
+            <w:pPr>
+              <w:rPr>
+                <w:lang w:val="en-AU" w:eastAsia="ko-KR"/>
+              </w:rPr>
+            </w:pPr>
+            <w:proofErr w:type="spellStart"/>
+            <w:r>
+              <w:rPr>
+                <w:lang w:val="en-AU" w:eastAsia="ko-KR"/>
+              </w:rPr>
+              <w:t>patient_id</w:t>
+            </w:r>
+            <w:proofErr w:type="spellEnd"/>
+            <w:r>
+              <w:rPr>
+                <w:lang w:val="en-AU" w:eastAsia="ko-KR"/>
+              </w:rPr>
+              <w:t xml:space="preserve"> + </w:t>
+            </w:r>
+            <w:proofErr w:type="spellStart"/>
+            <w:r>
+              <w:rPr>
+                <w:lang w:val="en-AU" w:eastAsia="ko-KR"/>
+              </w:rPr>
+              <w:t>display_name</w:t>
+            </w:r>
+            <w:proofErr w:type="spellEnd"/>
+            <w:r>
+              <w:rPr>
+                <w:lang w:val="en-AU" w:eastAsia="ko-KR"/>
+              </w:rPr>
+              <w:t xml:space="preserve"> (axis label), </w:t>
+            </w:r>
+            <w:proofErr w:type="spellStart"/>
+            <w:r>
+              <w:rPr>
+                <w:lang w:val="en-AU" w:eastAsia="ko-KR"/>
+              </w:rPr>
+              <w:t>pdc</w:t>
+            </w:r>
+            <w:proofErr w:type="spellEnd"/>
+            <w:r>
+              <w:rPr>
+                <w:lang w:val="en-AU" w:eastAsia="ko-KR"/>
+              </w:rPr>
+              <w:t xml:space="preserve"> (value), </w:t>
+            </w:r>
+            <w:proofErr w:type="spellStart"/>
+            <w:r>
+              <w:rPr>
+                <w:lang w:val="en-AU" w:eastAsia="ko-KR"/>
+              </w:rPr>
+              <w:t>adherence_status</w:t>
+            </w:r>
+            <w:proofErr w:type="spellEnd"/>
+            <w:r>
+              <w:rPr>
+                <w:lang w:val="en-AU" w:eastAsia="ko-KR"/>
+              </w:rPr>
+              <w:t xml:space="preserve"> (colour), </w:t>
+            </w:r>
+            <w:proofErr w:type="spellStart"/>
+            <w:r>
+              <w:rPr>
+                <w:lang w:val="en-AU" w:eastAsia="ko-KR"/>
+              </w:rPr>
+              <w:t>drug_class</w:t>
+            </w:r>
+            <w:proofErr w:type="spellEnd"/>
+            <w:r>
+              <w:rPr>
+                <w:lang w:val="en-AU" w:eastAsia="ko-KR"/>
+              </w:rPr>
+              <w:t xml:space="preserve"> (data label)</w:t>
+            </w:r>
+          </w:p>
+        </w:tc>
+        <w:tc>
+          <w:tcPr>
+            <w:tcW w:w="2146" w:type="dxa"/>
+          </w:tcPr>
+          <w:p>
+            <w:pPr>
+              <w:rPr>
+                <w:lang w:val="en-AU" w:eastAsia="ko-KR"/>
+              </w:rPr>
+            </w:pPr>
+            <w:r>
+              <w:rPr>
+                <w:lang w:val="en-AU" w:eastAsia="ko-KR"/>
+              </w:rPr>
+              <w:t xml:space="preserve">11 rows: ADHERENT 9, NON_ADHERENT 2 (GL-0002 0.333, GL-0010 0.500) </w:t>
+            </w:r>
+          </w:p>
+        </w:tc>
+      </w:tr>
+      <w:tr>
+        <w:tc>
+          <w:tcPr>
+            <w:tcW w:w="704" w:type="dxa"/>
+          </w:tcPr>
+          <w:p>
+            <w:pPr>
+              <w:rPr>
+                <w:lang w:val="en-AU" w:eastAsia="ko-KR"/>
+              </w:rPr>
+            </w:pPr>
+            <w:r>
+              <w:rPr>
+                <w:lang w:val="en-AU" w:eastAsia="ko-KR"/>
+              </w:rPr>
+              <w:t>UC3</w:t>
+            </w:r>
+          </w:p>
+        </w:tc>
+        <w:tc>
+          <w:tcPr>
+            <w:tcW w:w="1276" w:type="dxa"/>
+          </w:tcPr>
+          <w:p>
+            <w:pPr>
+              <w:rPr>
+                <w:lang w:val="en-AU" w:eastAsia="ko-KR"/>
+              </w:rPr>
+            </w:pPr>
+            <w:proofErr w:type="gramStart"/>
+            <w:r>
+              <w:rPr>
+                <w:lang w:val="en-AU" w:eastAsia="ko-KR"/>
+              </w:rPr>
+              <w:t>reporting.vw</w:t>
+            </w:r>
+            <w:proofErr w:type="gramEnd"/>
+            <w:r>
+              <w:rPr>
+                <w:lang w:val="en-AU" w:eastAsia="ko-KR"/>
+              </w:rPr>
+              <w:t>_uc3_hba1c_trend</w:t>
+            </w:r>
+          </w:p>
+        </w:tc>
+        <w:tc>
+          <w:tcPr>
+            <w:tcW w:w="3004" w:type="dxa"/>
+          </w:tcPr>
+          <w:p>
+            <w:pPr>
+              <w:rPr>
+                <w:lang w:val="en-AU" w:eastAsia="ko-KR"/>
+              </w:rPr>
+            </w:pPr>
+            <w:r>
+              <w:rPr>
+                <w:lang w:val="en-AU" w:eastAsia="ko-KR"/>
+              </w:rPr>
+              <w:t xml:space="preserve">Column chart: HbA1c change (mmol/mol) per patient, coloured by trend status; patients with </w:t>
+            </w:r>
+            <w:proofErr w:type="spellStart"/>
+            <w:r>
+              <w:rPr>
+                <w:lang w:val="en-AU" w:eastAsia="ko-KR"/>
+              </w:rPr>
+              <w:t>rising_despite_adherence</w:t>
+            </w:r>
+            <w:proofErr w:type="spellEnd"/>
+            <w:r>
+              <w:rPr>
+                <w:lang w:val="en-AU" w:eastAsia="ko-KR"/>
+              </w:rPr>
+              <w:t xml:space="preserve"> = true marked; INSUFFICIENT_HISTORY shown as blank, not zero</w:t>
+            </w:r>
+          </w:p>
+        </w:tc>
+        <w:tc>
+          <w:tcPr>
+            <w:tcW w:w="1886" w:type="dxa"/>
+          </w:tcPr>
+          <w:p>
+            <w:pPr>
+              <w:rPr>
+                <w:lang w:val="en-AU" w:eastAsia="ko-KR"/>
+              </w:rPr>
+            </w:pPr>
+            <w:proofErr w:type="spellStart"/>
+            <w:r>
+              <w:rPr>
+                <w:lang w:val="en-AU" w:eastAsia="ko-KR"/>
+              </w:rPr>
+              <w:t>patient_id</w:t>
+            </w:r>
+            <w:proofErr w:type="spellEnd"/>
+            <w:r>
+              <w:rPr>
+                <w:lang w:val="en-AU" w:eastAsia="ko-KR"/>
+              </w:rPr>
+              <w:t xml:space="preserve"> + </w:t>
+            </w:r>
+            <w:proofErr w:type="spellStart"/>
+            <w:r>
+              <w:rPr>
+                <w:lang w:val="en-AU" w:eastAsia="ko-KR"/>
+              </w:rPr>
+              <w:t>display_name</w:t>
+            </w:r>
+            <w:proofErr w:type="spellEnd"/>
+            <w:r>
+              <w:rPr>
+                <w:lang w:val="en-AU" w:eastAsia="ko-KR"/>
+              </w:rPr>
+              <w:t xml:space="preserve"> (axis), </w:t>
+            </w:r>
+            <w:proofErr w:type="spellStart"/>
+            <w:r>
+              <w:rPr>
+                <w:lang w:val="en-AU" w:eastAsia="ko-KR"/>
+              </w:rPr>
+              <w:t>change_mmol_mol</w:t>
+            </w:r>
+            <w:proofErr w:type="spellEnd"/>
+            <w:r>
+              <w:rPr>
+                <w:lang w:val="en-AU" w:eastAsia="ko-KR"/>
+              </w:rPr>
+              <w:t xml:space="preserve"> (value), </w:t>
+            </w:r>
+            <w:proofErr w:type="spellStart"/>
+            <w:r>
+              <w:rPr>
+                <w:lang w:val="en-AU" w:eastAsia="ko-KR"/>
+              </w:rPr>
+              <w:t>trend_status</w:t>
+            </w:r>
+            <w:proofErr w:type="spellEnd"/>
+            <w:r>
+              <w:rPr>
+                <w:lang w:val="en-AU" w:eastAsia="ko-KR"/>
+              </w:rPr>
+              <w:t xml:space="preserve"> (colour), </w:t>
+            </w:r>
+            <w:proofErr w:type="spellStart"/>
+            <w:r>
+              <w:rPr>
+                <w:lang w:val="en-AU" w:eastAsia="ko-KR"/>
+              </w:rPr>
+              <w:t>rising_despite_adherence</w:t>
+            </w:r>
+            <w:proofErr w:type="spellEnd"/>
+            <w:r>
+              <w:rPr>
+                <w:lang w:val="en-AU" w:eastAsia="ko-KR"/>
+              </w:rPr>
+              <w:t xml:space="preserve"> (marker), first_hba1c, last_hba1c, </w:t>
+            </w:r>
+            <w:proofErr w:type="spellStart"/>
+            <w:r>
+              <w:rPr>
+                <w:lang w:val="en-AU" w:eastAsia="ko-KR"/>
+              </w:rPr>
+              <w:t>best_pdc</w:t>
+            </w:r>
+            <w:proofErr w:type="spellEnd"/>
+            <w:r>
+              <w:rPr>
+                <w:lang w:val="en-AU" w:eastAsia="ko-KR"/>
+              </w:rPr>
+              <w:t xml:space="preserve"> (tooltip/table) </w:t>
+            </w:r>
+          </w:p>
+        </w:tc>
+        <w:tc>
+          <w:tcPr>
+            <w:tcW w:w="2146" w:type="dxa"/>
+          </w:tcPr>
+          <w:p>
+            <w:pPr>
+              <w:rPr>
+                <w:lang w:val="en-AU" w:eastAsia="ko-KR"/>
+              </w:rPr>
+            </w:pPr>
+            <w:r>
+              <w:rPr>
+                <w:lang w:val="en-AU" w:eastAsia="ko-KR"/>
+              </w:rPr>
+              <w:t xml:space="preserve">16 rows: RISING 4, STABLE 7, INSUFFICIENT_HISTORY 5, FALLING 0; rising despite adherence 2 (GL-0001, GL-0016) </w:t>
+            </w:r>
+          </w:p>
+        </w:tc>
+      </w:tr>
+      <w:tr>
+        <w:tc>
+          <w:tcPr>
+            <w:tcW w:w="704" w:type="dxa"/>
+          </w:tcPr>
+          <w:p>
+            <w:pPr>
+              <w:rPr>
+                <w:lang w:val="en-AU" w:eastAsia="ko-KR"/>
+              </w:rPr>
+            </w:pPr>
+            <w:r>
+              <w:rPr>
+                <w:lang w:val="en-AU" w:eastAsia="ko-KR"/>
+              </w:rPr>
+              <w:t>UC4</w:t>
+            </w:r>
+          </w:p>
+        </w:tc>
+        <w:tc>
+          <w:tcPr>
+            <w:tcW w:w="1276" w:type="dxa"/>
+          </w:tcPr>
+          <w:p>
+            <w:pPr>
+              <w:rPr>
+                <w:lang w:val="en-AU" w:eastAsia="ko-KR"/>
+              </w:rPr>
+            </w:pPr>
+            <w:proofErr w:type="gramStart"/>
+            <w:r>
+              <w:rPr>
+                <w:lang w:val="en-AU" w:eastAsia="ko-KR"/>
+              </w:rPr>
+              <w:t>reporting.vw</w:t>
+            </w:r>
+            <w:proofErr w:type="gramEnd"/>
+            <w:r>
+              <w:rPr>
+                <w:lang w:val="en-AU" w:eastAsia="ko-KR"/>
+              </w:rPr>
+              <w:t>_uc4_care_path_breaks</w:t>
+            </w:r>
+          </w:p>
+        </w:tc>
+        <w:tc>
+          <w:tcPr>
+            <w:tcW w:w="3004" w:type="dxa"/>
+          </w:tcPr>
+          <w:p>
+            <w:pPr>
+              <w:rPr>
+                <w:lang w:val="en-AU" w:eastAsia="ko-KR"/>
+              </w:rPr>
+            </w:pPr>
+            <w:r>
+              <w:rPr>
+                <w:lang w:val="en-AU" w:eastAsia="ko-KR"/>
+              </w:rPr>
+              <w:t>Column chart: number of breaks per break type, plus the full listing table beneath it (only 2 rows, so the table carries the detail)</w:t>
+            </w:r>
+          </w:p>
+        </w:tc>
+        <w:tc>
+          <w:tcPr>
+            <w:tcW w:w="1886" w:type="dxa"/>
+          </w:tcPr>
+          <w:p>
+            <w:pPr>
+              <w:rPr>
+                <w:lang w:val="en-AU" w:eastAsia="ko-KR"/>
+              </w:rPr>
+            </w:pPr>
+            <w:proofErr w:type="spellStart"/>
+            <w:r>
+              <w:rPr>
+                <w:lang w:val="en-AU" w:eastAsia="ko-KR"/>
+              </w:rPr>
+              <w:t>break_type</w:t>
+            </w:r>
+            <w:proofErr w:type="spellEnd"/>
+            <w:r>
+              <w:rPr>
+                <w:lang w:val="en-AU" w:eastAsia="ko-KR"/>
+              </w:rPr>
+              <w:t xml:space="preserve"> (category), count of </w:t>
+            </w:r>
+            <w:proofErr w:type="spellStart"/>
+            <w:r>
+              <w:rPr>
+                <w:lang w:val="en-AU" w:eastAsia="ko-KR"/>
+              </w:rPr>
+              <w:t>patient_id</w:t>
+            </w:r>
+            <w:proofErr w:type="spellEnd"/>
+            <w:r>
+              <w:rPr>
+                <w:lang w:val="en-AU" w:eastAsia="ko-KR"/>
+              </w:rPr>
+              <w:t xml:space="preserve"> (value); </w:t>
+            </w:r>
+            <w:proofErr w:type="spellStart"/>
+            <w:r>
+              <w:rPr>
+                <w:lang w:val="en-AU" w:eastAsia="ko-KR"/>
+              </w:rPr>
+              <w:t>display_name</w:t>
+            </w:r>
+            <w:proofErr w:type="spellEnd"/>
+            <w:r>
+              <w:rPr>
+                <w:lang w:val="en-AU" w:eastAsia="ko-KR"/>
+              </w:rPr>
+              <w:t xml:space="preserve">, detail, </w:t>
+            </w:r>
+            <w:proofErr w:type="spellStart"/>
+            <w:r>
+              <w:rPr>
+                <w:lang w:val="en-AU" w:eastAsia="ko-KR"/>
+              </w:rPr>
+              <w:t>event_date</w:t>
+            </w:r>
+            <w:proofErr w:type="spellEnd"/>
+            <w:r>
+              <w:rPr>
+                <w:lang w:val="en-AU" w:eastAsia="ko-KR"/>
+              </w:rPr>
+              <w:t xml:space="preserve"> in the table </w:t>
+            </w:r>
+          </w:p>
+        </w:tc>
+        <w:tc>
+          <w:tcPr>
+            <w:tcW w:w="2146" w:type="dxa"/>
+          </w:tcPr>
+          <w:p>
+            <w:pPr>
+              <w:rPr>
+                <w:rFonts w:ascii="Segoe UI Symbol" w:hAnsi="Segoe UI Symbol" w:cs="Segoe UI Symbol"/>
+                <w:lang w:val="en-AU" w:eastAsia="ko-KR"/>
+              </w:rPr>
+            </w:pPr>
+            <w:r>
+              <w:rPr>
+                <w:lang w:val="en-AU" w:eastAsia="ko-KR"/>
+              </w:rPr>
+              <w:t xml:space="preserve">2 rows: RESULT_NOT_RETURNED 1 (Olivia Brown, OBS-0010), MULTI_PHARMACY_OVERLAP 1 (James Wilson, biguanide) </w:t>
+            </w:r>
+          </w:p>
+        </w:tc>
+      </w:tr>
+    </w:tbl>
+    <w:p>
+      <w:pPr>
+        <w:rPr>
+          <w:rFonts w:ascii="Segoe UI Symbol" w:hAnsi="Segoe UI Symbol" w:cs="Segoe UI Symbol"/>
+          <w:lang w:val="en-AU" w:eastAsia="ko-KR"/>
+        </w:rPr>
+      </w:pPr>
+    </w:p>
+    <w:p>
+      <w:pPr>
+        <w:rPr>
+          <w:lang w:val="en-AU" w:eastAsia="ko-KR"/>
+        </w:rPr>
+      </w:pPr>
+      <w:r>
+        <w:rPr>
+          <w:lang w:val="en-AU" w:eastAsia="ko-KR"/>
+        </w:rPr>
+        <w:t>Each chart sheet carries a caption with the database name, export timestamp and frozen commit from the Control sheet.</w:t>
+      </w:r>
+    </w:p>
+    <w:p>
+      <w:pPr>
+        <w:pStyle w:val="Heading1"/>
+        <w:rPr>
+          <w:rFonts w:ascii="Calibri" w:hAnsi="Calibri" w:cs="Calibri"/>
+          <w:b/>
+          <w:bCs/>
+          <w:color w:val="000000" w:themeColor="text1"/>
+          <w:sz w:val="30"/>
+          <w:szCs w:val="30"/>
+        </w:rPr>
+      </w:pPr>
+      <w:r>
+        <w:rPr>
+          <w:rFonts w:ascii="Calibri" w:hAnsi="Calibri" w:cs="Calibri"/>
+          <w:b/>
+          <w:bCs/>
+          <w:color w:val="000000" w:themeColor="text1"/>
+          <w:sz w:val="30"/>
+          <w:szCs w:val="30"/>
+        </w:rPr>
+        <w:lastRenderedPageBreak/>
+        <w:t>6</w:t>
       </w:r>
       <w:r>
         <w:rPr>
@@ -1487,7 +2866,6 @@
     <w:p>
       <w:pPr>
         <w:rPr>
-          <w:rFonts w:hint="eastAsia"/>
           <w:lang w:val="en-AU"/>
         </w:rPr>
       </w:pPr>
@@ -2497,6 +3875,25 @@
       <w:spacing w:val="5"/>
     </w:rPr>
   </w:style>
+  <w:style w:type="table" w:styleId="TableGrid">
+    <w:name w:val="Table Grid"/>
+    <w:basedOn w:val="TableNormal"/>
+    <w:uiPriority w:val="39"/>
+    <w:rsid w:val="00556CEC"/>
+    <w:pPr>
+      <w:spacing w:after="0" w:line="240" w:lineRule="auto"/>
+    </w:pPr>
+    <w:tblPr>
+      <w:tblBorders>
+        <w:top w:val="single" w:sz="4" w:space="0" w:color="auto"/>
+        <w:left w:val="single" w:sz="4" w:space="0" w:color="auto"/>
+        <w:bottom w:val="single" w:sz="4" w:space="0" w:color="auto"/>
+        <w:right w:val="single" w:sz="4" w:space="0" w:color="auto"/>
+        <w:insideH w:val="single" w:sz="4" w:space="0" w:color="auto"/>
+        <w:insideV w:val="single" w:sz="4" w:space="0" w:color="auto"/>
+      </w:tblBorders>
+    </w:tblPr>
+  </w:style>
 </w:styles>
 </file>
 

</xml_diff>